<commit_message>
docs: update Word report with student info and GitHub Pages CI/CD deployment details
</commit_message>
<xml_diff>
--- a/BaoCao_GameClicker.docx
+++ b/BaoCao_GameClicker.docx
@@ -83,7 +83,51 @@
                 <w:color w:val="282828"/>
                 <w:sz w:val="22"/>
               </w:rPr>
-              <w:t>Đỗ Tâm</w:t>
+              <w:t>Nguyễn Hoàng Hùng</w:t>
+            </w:r>
+          </w:p>
+        </w:tc>
+      </w:tr>
+      <w:tr>
+        <w:tc>
+          <w:tcPr>
+            <w:tcW w:type="dxa" w:w="4680"/>
+            <w:tcMar>
+              <w:top w:w="100" w:type="dxa"/>
+              <w:bottom w:w="100" w:type="dxa"/>
+              <w:left w:w="150" w:type="dxa"/>
+              <w:right w:w="150" w:type="dxa"/>
+            </w:tcMar>
+          </w:tcPr>
+          <w:p>
+            <w:r>
+              <w:rPr>
+                <w:rFonts w:ascii="Arial" w:hAnsi="Arial"/>
+                <w:b/>
+                <w:sz w:val="22"/>
+              </w:rPr>
+              <w:t>Mã số sinh viên:</w:t>
+            </w:r>
+          </w:p>
+        </w:tc>
+        <w:tc>
+          <w:tcPr>
+            <w:tcW w:type="dxa" w:w="4680"/>
+            <w:tcMar>
+              <w:top w:w="100" w:type="dxa"/>
+              <w:bottom w:w="100" w:type="dxa"/>
+              <w:left w:w="150" w:type="dxa"/>
+              <w:right w:w="150" w:type="dxa"/>
+            </w:tcMar>
+          </w:tcPr>
+          <w:p>
+            <w:r>
+              <w:rPr>
+                <w:rFonts w:ascii="Arial" w:hAnsi="Arial"/>
+                <w:color w:val="282828"/>
+                <w:sz w:val="22"/>
+              </w:rPr>
+              <w:t>501250384</w:t>
             </w:r>
           </w:p>
         </w:tc>
@@ -132,6 +176,94 @@
           </w:p>
         </w:tc>
       </w:tr>
+      <w:tr>
+        <w:tc>
+          <w:tcPr>
+            <w:tcW w:type="dxa" w:w="4680"/>
+            <w:tcMar>
+              <w:top w:w="100" w:type="dxa"/>
+              <w:bottom w:w="100" w:type="dxa"/>
+              <w:left w:w="150" w:type="dxa"/>
+              <w:right w:w="150" w:type="dxa"/>
+            </w:tcMar>
+          </w:tcPr>
+          <w:p>
+            <w:r>
+              <w:rPr>
+                <w:rFonts w:ascii="Arial" w:hAnsi="Arial"/>
+                <w:b/>
+                <w:sz w:val="22"/>
+              </w:rPr>
+              <w:t>GitHub Repository:</w:t>
+            </w:r>
+          </w:p>
+        </w:tc>
+        <w:tc>
+          <w:tcPr>
+            <w:tcW w:type="dxa" w:w="4680"/>
+            <w:tcMar>
+              <w:top w:w="100" w:type="dxa"/>
+              <w:bottom w:w="100" w:type="dxa"/>
+              <w:left w:w="150" w:type="dxa"/>
+              <w:right w:w="150" w:type="dxa"/>
+            </w:tcMar>
+          </w:tcPr>
+          <w:p>
+            <w:r>
+              <w:rPr>
+                <w:rFonts w:ascii="Arial" w:hAnsi="Arial"/>
+                <w:color w:val="282828"/>
+                <w:sz w:val="22"/>
+              </w:rPr>
+              <w:t>https://github.com/ThanhThien07/GameJS.git</w:t>
+            </w:r>
+          </w:p>
+        </w:tc>
+      </w:tr>
+      <w:tr>
+        <w:tc>
+          <w:tcPr>
+            <w:tcW w:type="dxa" w:w="4680"/>
+            <w:tcMar>
+              <w:top w:w="100" w:type="dxa"/>
+              <w:bottom w:w="100" w:type="dxa"/>
+              <w:left w:w="150" w:type="dxa"/>
+              <w:right w:w="150" w:type="dxa"/>
+            </w:tcMar>
+          </w:tcPr>
+          <w:p>
+            <w:r>
+              <w:rPr>
+                <w:rFonts w:ascii="Arial" w:hAnsi="Arial"/>
+                <w:b/>
+                <w:sz w:val="22"/>
+              </w:rPr>
+              <w:t>Link Web GitHub Pages:</w:t>
+            </w:r>
+          </w:p>
+        </w:tc>
+        <w:tc>
+          <w:tcPr>
+            <w:tcW w:type="dxa" w:w="4680"/>
+            <w:tcMar>
+              <w:top w:w="100" w:type="dxa"/>
+              <w:bottom w:w="100" w:type="dxa"/>
+              <w:left w:w="150" w:type="dxa"/>
+              <w:right w:w="150" w:type="dxa"/>
+            </w:tcMar>
+          </w:tcPr>
+          <w:p>
+            <w:r>
+              <w:rPr>
+                <w:rFonts w:ascii="Arial" w:hAnsi="Arial"/>
+                <w:color w:val="282828"/>
+                <w:sz w:val="22"/>
+              </w:rPr>
+              <w:t>https://thanhthien07.github.io/GameJS/</w:t>
+            </w:r>
+          </w:p>
+        </w:tc>
+      </w:tr>
     </w:tbl>
     <w:p>
       <w:r>
@@ -173,7 +305,7 @@
           <w:rFonts w:ascii="Arial" w:hAnsi="Arial"/>
           <w:sz w:val="22"/>
         </w:rPr>
-        <w:t>Nhận thấy cơ hội nâng tầm thể loại này, sinh viên Đỗ Tâm đã quyết định thực hiện đề tài "Phát triển ứng dụng Web Game Tap Tap Clicker Multiplayer". Dự án tập trung giải quyết các bài toán:</w:t>
+        <w:t>Nhận thấy cơ hội nâng tầm thể loại này, sinh viên Nguyễn Hoàng Hùng (MSSV: 501250384) đã quyết định thực hiện đề tài "Phát triển ứng dụng Web Game Tap Tap Clicker Multiplayer". Dự án tập trung giải quyết các bài toán:</w:t>
       </w:r>
     </w:p>
     <w:p>
@@ -567,6 +699,95 @@
           <w:sz w:val="22"/>
         </w:rPr>
         <w:t>Bộ đếm thời gian 60 giây chạy trực tiếp trên Server và gửi nhịp tích tắc xuống client để chống gian lận thời gian ở máy khách.</w:t>
+      </w:r>
+    </w:p>
+    <w:p>
+      <w:pPr>
+        <w:spacing w:before="200" w:after="120"/>
+      </w:pPr>
+      <w:r>
+        <w:rPr>
+          <w:rFonts w:ascii="Arial" w:hAnsi="Arial"/>
+          <w:b/>
+          <w:color w:val="FF0080"/>
+          <w:sz w:val="26"/>
+        </w:rPr>
+        <w:t>2.3 Quy trình Triển khai Tự động (CI/CD &amp; GitHub Pages)</w:t>
+      </w:r>
+    </w:p>
+    <w:p>
+      <w:pPr>
+        <w:spacing w:after="160"/>
+      </w:pPr>
+      <w:r>
+        <w:rPr>
+          <w:rFonts w:ascii="Arial" w:hAnsi="Arial"/>
+          <w:sz w:val="22"/>
+        </w:rPr>
+        <w:t>Dự án được tự động hóa quy trình đóng gói và triển khai (CI/CD) lên nền tảng GitHub Pages thông qua GitHub Actions (`.github/workflows/deploy.yml`). Khi có bất kỳ thay đổi nào được push lên branch main, hệ thống sẽ tự động khởi tạo môi trường Node.js, đóng gói bản build Vite và deploy giao diện web lên địa chỉ công khai:</w:t>
+      </w:r>
+    </w:p>
+    <w:p>
+      <w:pPr>
+        <w:pStyle w:val="ListBullet"/>
+        <w:spacing w:after="80"/>
+      </w:pPr>
+      <w:r>
+        <w:rPr>
+          <w:rFonts w:ascii="Arial" w:hAnsi="Arial"/>
+          <w:b/>
+          <w:sz w:val="22"/>
+        </w:rPr>
+        <w:t xml:space="preserve">Cấu hình Vite Base Path (`vite.config.js`): </w:t>
+      </w:r>
+      <w:r>
+        <w:rPr>
+          <w:rFonts w:ascii="Arial" w:hAnsi="Arial"/>
+          <w:sz w:val="22"/>
+        </w:rPr>
+        <w:t>Thiết lập base: '/GameJS/' để đảm bảo các tài nguyên tĩnh (JavaScript, CSS, Assets) tải chính xác trên GitHub Pages.</w:t>
+      </w:r>
+    </w:p>
+    <w:p>
+      <w:pPr>
+        <w:pStyle w:val="ListBullet"/>
+        <w:spacing w:after="80"/>
+      </w:pPr>
+      <w:r>
+        <w:rPr>
+          <w:rFonts w:ascii="Arial" w:hAnsi="Arial"/>
+          <w:b/>
+          <w:sz w:val="22"/>
+        </w:rPr>
+        <w:t xml:space="preserve">Tự động hóa build với GitHub Actions: </w:t>
+      </w:r>
+      <w:r>
+        <w:rPr>
+          <w:rFonts w:ascii="Arial" w:hAnsi="Arial"/>
+          <w:sz w:val="22"/>
+        </w:rPr>
+        <w:t>Workflow tự động thực hiện các lệnh `npm ci`, `npm run build` và đẩy thư mục `dist/` lên môi trường gh-pages trong chưa đầy 1 phút.</w:t>
+      </w:r>
+    </w:p>
+    <w:p>
+      <w:pPr>
+        <w:pStyle w:val="ListBullet"/>
+        <w:spacing w:after="80"/>
+      </w:pPr>
+      <w:r>
+        <w:rPr>
+          <w:rFonts w:ascii="Arial" w:hAnsi="Arial"/>
+          <w:b/>
+          <w:sz w:val="22"/>
+        </w:rPr>
+        <w:t xml:space="preserve">Địa chỉ truy cập trực tuyến: </w:t>
+      </w:r>
+      <w:r>
+        <w:rPr>
+          <w:rFonts w:ascii="Arial" w:hAnsi="Arial"/>
+          <w:sz w:val="22"/>
+        </w:rPr>
+        <w:t>https://thanhthien07.github.io/GameJS/</w:t>
       </w:r>
     </w:p>
     <w:p>

</xml_diff>

<commit_message>
fix: socket created once on mount (not re-created on playMode change), add railway.json build config, remove prestart
</commit_message>
<xml_diff>
--- a/BaoCao_GameClicker.docx
+++ b/BaoCao_GameClicker.docx
@@ -213,6 +213,7 @@
         <w:rPr>
           <w:rFonts w:ascii="Times New Roman" w:hAnsi="Times New Roman"/>
           <w:b/>
+          <w:color w:val="000000"/>
           <w:sz w:val="36"/>
         </w:rPr>
         <w:t>PHÂN TÍCH THIẾT KẾ VÀ XÂY DỰNG GAME SIÊU CLICKER TAM HỢP</w:t>
@@ -238,6 +239,7 @@
         <w:rPr>
           <w:rFonts w:ascii="Times New Roman" w:hAnsi="Times New Roman"/>
           <w:b/>
+          <w:color w:val="000000"/>
           <w:sz w:val="28"/>
         </w:rPr>
         <w:t>HỌC KỲ 3, NĂM HỌC 2025 - 2026</w:t>
@@ -272,6 +274,7 @@
         <w:rPr>
           <w:rFonts w:ascii="Times New Roman" w:hAnsi="Times New Roman"/>
           <w:b/>
+          <w:color w:val="000000"/>
           <w:sz w:val="32"/>
         </w:rPr>
         <w:t>NHÓM DECIBEL</w:t>
@@ -339,6 +342,7 @@
         <w:rPr>
           <w:rFonts w:ascii="Times New Roman" w:hAnsi="Times New Roman"/>
           <w:b/>
+          <w:color w:val="000000"/>
           <w:sz w:val="26"/>
         </w:rPr>
         <w:t>NSVTH: NGUYỄN HOÀNG HƯNG  (MSSV: 501250384)</w:t>
@@ -362,6 +366,7 @@
         <w:rPr>
           <w:rFonts w:ascii="Times New Roman" w:hAnsi="Times New Roman"/>
           <w:b/>
+          <w:color w:val="000000"/>
           <w:sz w:val="26"/>
         </w:rPr>
         <w:tab/>
@@ -387,6 +392,7 @@
         <w:rPr>
           <w:rFonts w:ascii="Times New Roman" w:hAnsi="Times New Roman"/>
           <w:b w:val="0"/>
+          <w:color w:val="000000"/>
           <w:sz w:val="26"/>
         </w:rPr>
       </w:r>
@@ -409,6 +415,7 @@
         <w:rPr>
           <w:rFonts w:ascii="Times New Roman" w:hAnsi="Times New Roman"/>
           <w:b/>
+          <w:color w:val="000000"/>
           <w:sz w:val="26"/>
         </w:rPr>
         <w:t>MÔN : JAVASCRIPTS</w:t>
@@ -432,6 +439,7 @@
         <w:rPr>
           <w:rFonts w:ascii="Times New Roman" w:hAnsi="Times New Roman"/>
           <w:b/>
+          <w:color w:val="000000"/>
           <w:sz w:val="26"/>
         </w:rPr>
         <w:t>LỚP: CD25CT6</w:t>
@@ -455,6 +463,7 @@
         <w:rPr>
           <w:rFonts w:ascii="Times New Roman" w:hAnsi="Times New Roman"/>
           <w:b/>
+          <w:color w:val="000000"/>
           <w:sz w:val="26"/>
         </w:rPr>
         <w:t>GVHD: ThS. Trương Châu Long</w:t>
@@ -516,6 +525,7 @@
         <w:rPr>
           <w:rFonts w:ascii="Times New Roman" w:hAnsi="Times New Roman"/>
           <w:b/>
+          <w:color w:val="000000"/>
           <w:sz w:val="24"/>
         </w:rPr>
         <w:t>Tp. Hồ Chí Minh, tháng 07 năm 2026</w:t>
@@ -2765,16 +2775,16 @@
         <w:rPr>
           <w:rFonts w:ascii="Times New Roman" w:hAnsi="Times New Roman"/>
           <w:b/>
-          <w:color w:val="7C3AED"/>
-          <w:sz w:val="32"/>
+          <w:color w:val="000000"/>
+          <w:sz w:val="30"/>
         </w:rPr>
         <w:t>LỜI CẢM ƠN</w:t>
       </w:r>
     </w:p>
     <w:p>
       <w:pPr>
-        <w:spacing w:before="40" w:after="100" w:line="288" w:lineRule="auto"/>
-        <w:ind w:firstLine="432"/>
+        <w:spacing w:before="40" w:after="80" w:line="288" w:lineRule="auto"/>
+        <w:ind w:firstLine="720"/>
         <w:jc w:val="both"/>
       </w:pPr>
       <w:r>
@@ -2782,7 +2792,7 @@
           <w:rFonts w:ascii="Times New Roman" w:hAnsi="Times New Roman"/>
           <w:b w:val="0"/>
           <w:i w:val="0"/>
-          <w:color w:val="1E293B"/>
+          <w:color w:val="000000"/>
           <w:sz w:val="26"/>
         </w:rPr>
         <w:t>Lời đầu tiên, nhóm chúng em xin gửi lời cảm ơn chân thành và sâu sắc nhất đến Ban Giám hiệu Trường Cao đẳng Công nghệ Thông tin TP. Hồ Chí Minh cùng toàn thể quý Thầy Cô Khoa Công nghệ Thông tin – Điện tử đã tạo điều kiện học tập tốt nhất, môi trường rèn luyện hiện đại và truyền đạt những nền tảng kiến thức chuyên môn quý báu cho chúng em trong suốt thời gian qua.</w:t>
@@ -2790,8 +2800,8 @@
     </w:p>
     <w:p>
       <w:pPr>
-        <w:spacing w:before="40" w:after="100" w:line="288" w:lineRule="auto"/>
-        <w:ind w:firstLine="432"/>
+        <w:spacing w:before="40" w:after="80" w:line="288" w:lineRule="auto"/>
+        <w:ind w:firstLine="720"/>
         <w:jc w:val="both"/>
       </w:pPr>
       <w:r>
@@ -2799,7 +2809,7 @@
           <w:rFonts w:ascii="Times New Roman" w:hAnsi="Times New Roman"/>
           <w:b w:val="0"/>
           <w:i w:val="0"/>
-          <w:color w:val="1E293B"/>
+          <w:color w:val="000000"/>
           <w:sz w:val="26"/>
         </w:rPr>
         <w:t>Đặc biệt, nhóm chúng em xin bày tỏ lòng biết ơn sâu sắc nhất tới thầy ThS. Trương Châu Long — giảng viên phụ trách môn JAVASCRIPTS. Thầy đã tận tình hướng dẫn, trang bị cho chúng em những tư duy lập trình hiện đại, phương pháp xây dựng ứng dụng Web thời gian thực và luôn đưa ra những lời khuyên, đóng góp định hướng kịp thời để nhóm hoàn thiện đồ án này một cách chỉn chu và bài bản nhất.</w:t>
@@ -2807,8 +2817,8 @@
     </w:p>
     <w:p>
       <w:pPr>
-        <w:spacing w:before="40" w:after="100" w:line="288" w:lineRule="auto"/>
-        <w:ind w:firstLine="432"/>
+        <w:spacing w:before="40" w:after="80" w:line="288" w:lineRule="auto"/>
+        <w:ind w:firstLine="720"/>
         <w:jc w:val="both"/>
       </w:pPr>
       <w:r>
@@ -2816,7 +2826,7 @@
           <w:rFonts w:ascii="Times New Roman" w:hAnsi="Times New Roman"/>
           <w:b w:val="0"/>
           <w:i w:val="0"/>
-          <w:color w:val="1E293B"/>
+          <w:color w:val="000000"/>
           <w:sz w:val="26"/>
         </w:rPr>
         <w:t>Mặc dù nhóm đã dành nhiều tâm huyết và nỗ lực để hoàn thành đồ án, song do kiến thức và kinh nghiệm thực tế của chúng em còn hạn chế nên sản phẩm khó tránh khỏi những thiếu sót. Nhóm rất mong nhận được sự chỉ bảo, nhận xét và đánh giá quý báu từ thầy ThS. Trương Châu Long để sản phẩm của chúng em ngày càng hoàn thiện hơn.</w:t>
@@ -2824,8 +2834,8 @@
     </w:p>
     <w:p>
       <w:pPr>
-        <w:spacing w:before="40" w:after="100" w:line="288" w:lineRule="auto"/>
-        <w:ind w:firstLine="432"/>
+        <w:spacing w:before="40" w:after="80" w:line="288" w:lineRule="auto"/>
+        <w:ind w:firstLine="720"/>
         <w:jc w:val="both"/>
       </w:pPr>
       <w:r>
@@ -2833,7 +2843,7 @@
           <w:rFonts w:ascii="Times New Roman" w:hAnsi="Times New Roman"/>
           <w:b w:val="0"/>
           <w:i w:val="0"/>
-          <w:color w:val="1E293B"/>
+          <w:color w:val="000000"/>
           <w:sz w:val="26"/>
         </w:rPr>
         <w:t>Nhóm xin trân trọng và chân thành cảm ơn!</w:t>
@@ -2854,8 +2864,8 @@
         <w:rPr>
           <w:rFonts w:ascii="Times New Roman" w:hAnsi="Times New Roman"/>
           <w:b/>
-          <w:color w:val="7C3AED"/>
-          <w:sz w:val="32"/>
+          <w:color w:val="000000"/>
+          <w:sz w:val="30"/>
         </w:rPr>
         <w:t>MỤC LỤC</w:t>
       </w:r>
@@ -2864,12 +2874,15 @@
       <w:pPr>
         <w:spacing w:before="40" w:after="60" w:line="276" w:lineRule="auto"/>
         <w:jc w:val="left"/>
-      </w:pPr>
-      <w:r>
-        <w:rPr>
-          <w:rFonts w:ascii="Times New Roman" w:hAnsi="Times New Roman"/>
-          <w:b/>
-          <w:color w:val="0F172A"/>
+        <w:tabs>
+          <w:tab w:val="right" w:leader="dot" w:pos="9072"/>
+        </w:tabs>
+      </w:pPr>
+      <w:r>
+        <w:rPr>
+          <w:rFonts w:ascii="Times New Roman" w:hAnsi="Times New Roman"/>
+          <w:b/>
+          <w:color w:val="000000"/>
           <w:sz w:val="24"/>
         </w:rPr>
         <w:t>LỜI CẢM ƠN</w:t>
@@ -2877,15 +2890,14 @@
       <w:r>
         <w:rPr>
           <w:rFonts w:ascii="Times New Roman" w:hAnsi="Times New Roman"/>
-          <w:color w:val="94A3B8"/>
-          <w:sz w:val="20"/>
-        </w:rPr>
-        <w:t xml:space="preserve"> ................................... </w:t>
-      </w:r>
-      <w:r>
-        <w:rPr>
-          <w:rFonts w:ascii="Times New Roman" w:hAnsi="Times New Roman"/>
-          <w:b/>
+        </w:rPr>
+        <w:tab/>
+      </w:r>
+      <w:r>
+        <w:rPr>
+          <w:rFonts w:ascii="Times New Roman" w:hAnsi="Times New Roman"/>
+          <w:b/>
+          <w:color w:val="000000"/>
           <w:sz w:val="24"/>
         </w:rPr>
         <w:t>2</w:t>
@@ -2895,12 +2907,15 @@
       <w:pPr>
         <w:spacing w:before="40" w:after="60" w:line="276" w:lineRule="auto"/>
         <w:jc w:val="left"/>
-      </w:pPr>
-      <w:r>
-        <w:rPr>
-          <w:rFonts w:ascii="Times New Roman" w:hAnsi="Times New Roman"/>
-          <w:b/>
-          <w:color w:val="0F172A"/>
+        <w:tabs>
+          <w:tab w:val="right" w:leader="dot" w:pos="9072"/>
+        </w:tabs>
+      </w:pPr>
+      <w:r>
+        <w:rPr>
+          <w:rFonts w:ascii="Times New Roman" w:hAnsi="Times New Roman"/>
+          <w:b/>
+          <w:color w:val="000000"/>
           <w:sz w:val="24"/>
         </w:rPr>
         <w:t>MỤC LỤC</w:t>
@@ -2908,15 +2923,14 @@
       <w:r>
         <w:rPr>
           <w:rFonts w:ascii="Times New Roman" w:hAnsi="Times New Roman"/>
-          <w:color w:val="94A3B8"/>
-          <w:sz w:val="20"/>
-        </w:rPr>
-        <w:t xml:space="preserve"> ...................................... </w:t>
-      </w:r>
-      <w:r>
-        <w:rPr>
-          <w:rFonts w:ascii="Times New Roman" w:hAnsi="Times New Roman"/>
-          <w:b/>
+        </w:rPr>
+        <w:tab/>
+      </w:r>
+      <w:r>
+        <w:rPr>
+          <w:rFonts w:ascii="Times New Roman" w:hAnsi="Times New Roman"/>
+          <w:b/>
+          <w:color w:val="000000"/>
           <w:sz w:val="24"/>
         </w:rPr>
         <w:t>3</w:t>
@@ -2926,12 +2940,15 @@
       <w:pPr>
         <w:spacing w:before="40" w:after="60" w:line="276" w:lineRule="auto"/>
         <w:jc w:val="left"/>
-      </w:pPr>
-      <w:r>
-        <w:rPr>
-          <w:rFonts w:ascii="Times New Roman" w:hAnsi="Times New Roman"/>
-          <w:b/>
-          <w:color w:val="0F172A"/>
+        <w:tabs>
+          <w:tab w:val="right" w:leader="dot" w:pos="9072"/>
+        </w:tabs>
+      </w:pPr>
+      <w:r>
+        <w:rPr>
+          <w:rFonts w:ascii="Times New Roman" w:hAnsi="Times New Roman"/>
+          <w:b/>
+          <w:color w:val="000000"/>
           <w:sz w:val="24"/>
         </w:rPr>
         <w:t>MỞ ĐẦU</w:t>
@@ -2939,15 +2956,14 @@
       <w:r>
         <w:rPr>
           <w:rFonts w:ascii="Times New Roman" w:hAnsi="Times New Roman"/>
-          <w:color w:val="94A3B8"/>
-          <w:sz w:val="20"/>
-        </w:rPr>
-        <w:t xml:space="preserve"> ....................................... </w:t>
-      </w:r>
-      <w:r>
-        <w:rPr>
-          <w:rFonts w:ascii="Times New Roman" w:hAnsi="Times New Roman"/>
-          <w:b/>
+        </w:rPr>
+        <w:tab/>
+      </w:r>
+      <w:r>
+        <w:rPr>
+          <w:rFonts w:ascii="Times New Roman" w:hAnsi="Times New Roman"/>
+          <w:b/>
+          <w:color w:val="000000"/>
           <w:sz w:val="24"/>
         </w:rPr>
         <w:t>4</w:t>
@@ -2957,12 +2973,15 @@
       <w:pPr>
         <w:spacing w:before="40" w:after="60" w:line="276" w:lineRule="auto"/>
         <w:jc w:val="left"/>
-      </w:pPr>
-      <w:r>
-        <w:rPr>
-          <w:rFonts w:ascii="Times New Roman" w:hAnsi="Times New Roman"/>
-          <w:b/>
-          <w:color w:val="0F172A"/>
+        <w:tabs>
+          <w:tab w:val="right" w:leader="dot" w:pos="9072"/>
+        </w:tabs>
+      </w:pPr>
+      <w:r>
+        <w:rPr>
+          <w:rFonts w:ascii="Times New Roman" w:hAnsi="Times New Roman"/>
+          <w:b/>
+          <w:color w:val="000000"/>
           <w:sz w:val="24"/>
         </w:rPr>
         <w:t>CHƯƠNG 1: GIỚI THIỆU ĐỀ TÀI GAME CLICKER</w:t>
@@ -2970,15 +2989,14 @@
       <w:r>
         <w:rPr>
           <w:rFonts w:ascii="Times New Roman" w:hAnsi="Times New Roman"/>
-          <w:color w:val="94A3B8"/>
-          <w:sz w:val="20"/>
-        </w:rPr>
-        <w:t xml:space="preserve"> ..... </w:t>
-      </w:r>
-      <w:r>
-        <w:rPr>
-          <w:rFonts w:ascii="Times New Roman" w:hAnsi="Times New Roman"/>
-          <w:b/>
+        </w:rPr>
+        <w:tab/>
+      </w:r>
+      <w:r>
+        <w:rPr>
+          <w:rFonts w:ascii="Times New Roman" w:hAnsi="Times New Roman"/>
+          <w:b/>
+          <w:color w:val="000000"/>
           <w:sz w:val="24"/>
         </w:rPr>
         <w:t>5</w:t>
@@ -2988,28 +3006,30 @@
       <w:pPr>
         <w:spacing w:before="40" w:after="60" w:line="276" w:lineRule="auto"/>
         <w:jc w:val="left"/>
+        <w:tabs>
+          <w:tab w:val="right" w:leader="dot" w:pos="9072"/>
+        </w:tabs>
       </w:pPr>
       <w:r>
         <w:rPr>
           <w:rFonts w:ascii="Times New Roman" w:hAnsi="Times New Roman"/>
           <w:b w:val="0"/>
-          <w:color w:val="334155"/>
+          <w:color w:val="000000"/>
           <w:sz w:val="24"/>
         </w:rPr>
-        <w:t xml:space="preserve">   1.1. Bối cảnh và Tính cấp thiết của Đề tài</w:t>
-      </w:r>
-      <w:r>
-        <w:rPr>
-          <w:rFonts w:ascii="Times New Roman" w:hAnsi="Times New Roman"/>
-          <w:color w:val="94A3B8"/>
-          <w:sz w:val="20"/>
-        </w:rPr>
-        <w:t xml:space="preserve"> .. </w:t>
+        <w:t xml:space="preserve">    1.1. Bối cảnh và Tính cấp thiết của Đề tài</w:t>
+      </w:r>
+      <w:r>
+        <w:rPr>
+          <w:rFonts w:ascii="Times New Roman" w:hAnsi="Times New Roman"/>
+        </w:rPr>
+        <w:tab/>
       </w:r>
       <w:r>
         <w:rPr>
           <w:rFonts w:ascii="Times New Roman" w:hAnsi="Times New Roman"/>
           <w:b w:val="0"/>
+          <w:color w:val="000000"/>
           <w:sz w:val="24"/>
         </w:rPr>
         <w:t>5</w:t>
@@ -3019,28 +3039,30 @@
       <w:pPr>
         <w:spacing w:before="40" w:after="60" w:line="276" w:lineRule="auto"/>
         <w:jc w:val="left"/>
+        <w:tabs>
+          <w:tab w:val="right" w:leader="dot" w:pos="9072"/>
+        </w:tabs>
       </w:pPr>
       <w:r>
         <w:rPr>
           <w:rFonts w:ascii="Times New Roman" w:hAnsi="Times New Roman"/>
           <w:b w:val="0"/>
-          <w:color w:val="334155"/>
+          <w:color w:val="000000"/>
           <w:sz w:val="24"/>
         </w:rPr>
-        <w:t xml:space="preserve">   1.2. Mục tiêu nghiên cứu và Xây dựng Game</w:t>
-      </w:r>
-      <w:r>
-        <w:rPr>
-          <w:rFonts w:ascii="Times New Roman" w:hAnsi="Times New Roman"/>
-          <w:color w:val="94A3B8"/>
-          <w:sz w:val="20"/>
-        </w:rPr>
-        <w:t xml:space="preserve"> .. </w:t>
+        <w:t xml:space="preserve">    1.2. Mục tiêu nghiên cứu và Xây dựng Game</w:t>
+      </w:r>
+      <w:r>
+        <w:rPr>
+          <w:rFonts w:ascii="Times New Roman" w:hAnsi="Times New Roman"/>
+        </w:rPr>
+        <w:tab/>
       </w:r>
       <w:r>
         <w:rPr>
           <w:rFonts w:ascii="Times New Roman" w:hAnsi="Times New Roman"/>
           <w:b w:val="0"/>
+          <w:color w:val="000000"/>
           <w:sz w:val="24"/>
         </w:rPr>
         <w:t>5</w:t>
@@ -3050,28 +3072,30 @@
       <w:pPr>
         <w:spacing w:before="40" w:after="60" w:line="276" w:lineRule="auto"/>
         <w:jc w:val="left"/>
+        <w:tabs>
+          <w:tab w:val="right" w:leader="dot" w:pos="9072"/>
+        </w:tabs>
       </w:pPr>
       <w:r>
         <w:rPr>
           <w:rFonts w:ascii="Times New Roman" w:hAnsi="Times New Roman"/>
           <w:b w:val="0"/>
-          <w:color w:val="334155"/>
+          <w:color w:val="000000"/>
           <w:sz w:val="24"/>
         </w:rPr>
-        <w:t xml:space="preserve">   1.3. Lợi ích và Phạm vi ứng dụng của Sản phẩm</w:t>
-      </w:r>
-      <w:r>
-        <w:rPr>
-          <w:rFonts w:ascii="Times New Roman" w:hAnsi="Times New Roman"/>
-          <w:color w:val="94A3B8"/>
-          <w:sz w:val="20"/>
-        </w:rPr>
-        <w:t xml:space="preserve"> .. </w:t>
+        <w:t xml:space="preserve">    1.3. Lợi ích và Phạm vi ứng dụng của Sản phẩm</w:t>
+      </w:r>
+      <w:r>
+        <w:rPr>
+          <w:rFonts w:ascii="Times New Roman" w:hAnsi="Times New Roman"/>
+        </w:rPr>
+        <w:tab/>
       </w:r>
       <w:r>
         <w:rPr>
           <w:rFonts w:ascii="Times New Roman" w:hAnsi="Times New Roman"/>
           <w:b w:val="0"/>
+          <w:color w:val="000000"/>
           <w:sz w:val="24"/>
         </w:rPr>
         <w:t>6</w:t>
@@ -3081,12 +3105,15 @@
       <w:pPr>
         <w:spacing w:before="40" w:after="60" w:line="276" w:lineRule="auto"/>
         <w:jc w:val="left"/>
-      </w:pPr>
-      <w:r>
-        <w:rPr>
-          <w:rFonts w:ascii="Times New Roman" w:hAnsi="Times New Roman"/>
-          <w:b/>
-          <w:color w:val="0F172A"/>
+        <w:tabs>
+          <w:tab w:val="right" w:leader="dot" w:pos="9072"/>
+        </w:tabs>
+      </w:pPr>
+      <w:r>
+        <w:rPr>
+          <w:rFonts w:ascii="Times New Roman" w:hAnsi="Times New Roman"/>
+          <w:b/>
+          <w:color w:val="000000"/>
           <w:sz w:val="24"/>
         </w:rPr>
         <w:t>CHƯƠNG 2: PHÂN TÍCH VÀ THIẾT KẾ HỆ THỐNG GAME</w:t>
@@ -3094,15 +3121,14 @@
       <w:r>
         <w:rPr>
           <w:rFonts w:ascii="Times New Roman" w:hAnsi="Times New Roman"/>
-          <w:color w:val="94A3B8"/>
-          <w:sz w:val="20"/>
-        </w:rPr>
-        <w:t xml:space="preserve"> .. </w:t>
-      </w:r>
-      <w:r>
-        <w:rPr>
-          <w:rFonts w:ascii="Times New Roman" w:hAnsi="Times New Roman"/>
-          <w:b/>
+        </w:rPr>
+        <w:tab/>
+      </w:r>
+      <w:r>
+        <w:rPr>
+          <w:rFonts w:ascii="Times New Roman" w:hAnsi="Times New Roman"/>
+          <w:b/>
+          <w:color w:val="000000"/>
           <w:sz w:val="24"/>
         </w:rPr>
         <w:t>7</w:t>
@@ -3112,28 +3138,30 @@
       <w:pPr>
         <w:spacing w:before="40" w:after="60" w:line="276" w:lineRule="auto"/>
         <w:jc w:val="left"/>
+        <w:tabs>
+          <w:tab w:val="right" w:leader="dot" w:pos="9072"/>
+        </w:tabs>
       </w:pPr>
       <w:r>
         <w:rPr>
           <w:rFonts w:ascii="Times New Roman" w:hAnsi="Times New Roman"/>
           <w:b w:val="0"/>
-          <w:color w:val="334155"/>
+          <w:color w:val="000000"/>
           <w:sz w:val="24"/>
         </w:rPr>
-        <w:t xml:space="preserve">   2.1. Phân hệ Chế độ Chơi Ngoại tuyến (Offline Mode)</w:t>
-      </w:r>
-      <w:r>
-        <w:rPr>
-          <w:rFonts w:ascii="Times New Roman" w:hAnsi="Times New Roman"/>
-          <w:color w:val="94A3B8"/>
-          <w:sz w:val="20"/>
-        </w:rPr>
-        <w:t xml:space="preserve"> .. </w:t>
+        <w:t xml:space="preserve">    2.1. Phân hệ Chế độ Chơi Ngoại tuyến (Offline Mode)</w:t>
+      </w:r>
+      <w:r>
+        <w:rPr>
+          <w:rFonts w:ascii="Times New Roman" w:hAnsi="Times New Roman"/>
+        </w:rPr>
+        <w:tab/>
       </w:r>
       <w:r>
         <w:rPr>
           <w:rFonts w:ascii="Times New Roman" w:hAnsi="Times New Roman"/>
           <w:b w:val="0"/>
+          <w:color w:val="000000"/>
           <w:sz w:val="24"/>
         </w:rPr>
         <w:t>7</w:t>
@@ -3143,28 +3171,30 @@
       <w:pPr>
         <w:spacing w:before="40" w:after="60" w:line="276" w:lineRule="auto"/>
         <w:jc w:val="left"/>
+        <w:tabs>
+          <w:tab w:val="right" w:leader="dot" w:pos="9072"/>
+        </w:tabs>
       </w:pPr>
       <w:r>
         <w:rPr>
           <w:rFonts w:ascii="Times New Roman" w:hAnsi="Times New Roman"/>
           <w:b w:val="0"/>
-          <w:color w:val="334155"/>
+          <w:color w:val="000000"/>
           <w:sz w:val="24"/>
         </w:rPr>
-        <w:t xml:space="preserve">   2.2. Phân hệ Chế độ Chơi Đấu trường Trực tuyến (Competitive Real-time 1v1v1)</w:t>
-      </w:r>
-      <w:r>
-        <w:rPr>
-          <w:rFonts w:ascii="Times New Roman" w:hAnsi="Times New Roman"/>
-          <w:color w:val="94A3B8"/>
-          <w:sz w:val="20"/>
-        </w:rPr>
-        <w:t xml:space="preserve"> .. </w:t>
+        <w:t xml:space="preserve">    2.2. Phân hệ Chế độ Chơi Đấu trường Trực tuyến (Competitive Real-time 1v1v1)</w:t>
+      </w:r>
+      <w:r>
+        <w:rPr>
+          <w:rFonts w:ascii="Times New Roman" w:hAnsi="Times New Roman"/>
+        </w:rPr>
+        <w:tab/>
       </w:r>
       <w:r>
         <w:rPr>
           <w:rFonts w:ascii="Times New Roman" w:hAnsi="Times New Roman"/>
           <w:b w:val="0"/>
+          <w:color w:val="000000"/>
           <w:sz w:val="24"/>
         </w:rPr>
         <w:t>8</w:t>
@@ -3174,28 +3204,30 @@
       <w:pPr>
         <w:spacing w:before="40" w:after="60" w:line="276" w:lineRule="auto"/>
         <w:jc w:val="left"/>
+        <w:tabs>
+          <w:tab w:val="right" w:leader="dot" w:pos="9072"/>
+        </w:tabs>
       </w:pPr>
       <w:r>
         <w:rPr>
           <w:rFonts w:ascii="Times New Roman" w:hAnsi="Times New Roman"/>
           <w:b w:val="0"/>
-          <w:color w:val="334155"/>
+          <w:color w:val="000000"/>
           <w:sz w:val="24"/>
         </w:rPr>
-        <w:t xml:space="preserve">   2.3. Phân hệ Chế độ Chơi Hợp tác Trực tuyến (Co-op 3 Players)</w:t>
-      </w:r>
-      <w:r>
-        <w:rPr>
-          <w:rFonts w:ascii="Times New Roman" w:hAnsi="Times New Roman"/>
-          <w:color w:val="94A3B8"/>
-          <w:sz w:val="20"/>
-        </w:rPr>
-        <w:t xml:space="preserve"> .. </w:t>
+        <w:t xml:space="preserve">    2.3. Phân hệ Chế độ Chơi Hợp tác Trực tuyến (Co-op 3 Players)</w:t>
+      </w:r>
+      <w:r>
+        <w:rPr>
+          <w:rFonts w:ascii="Times New Roman" w:hAnsi="Times New Roman"/>
+        </w:rPr>
+        <w:tab/>
       </w:r>
       <w:r>
         <w:rPr>
           <w:rFonts w:ascii="Times New Roman" w:hAnsi="Times New Roman"/>
           <w:b w:val="0"/>
+          <w:color w:val="000000"/>
           <w:sz w:val="24"/>
         </w:rPr>
         <w:t>9</w:t>
@@ -3205,28 +3237,30 @@
       <w:pPr>
         <w:spacing w:before="40" w:after="60" w:line="276" w:lineRule="auto"/>
         <w:jc w:val="left"/>
+        <w:tabs>
+          <w:tab w:val="right" w:leader="dot" w:pos="9072"/>
+        </w:tabs>
       </w:pPr>
       <w:r>
         <w:rPr>
           <w:rFonts w:ascii="Times New Roman" w:hAnsi="Times New Roman"/>
           <w:b w:val="0"/>
-          <w:color w:val="334155"/>
+          <w:color w:val="000000"/>
           <w:sz w:val="24"/>
         </w:rPr>
-        <w:t xml:space="preserve">   2.4. Phân hệ Đồ họa 3D Cartoon Theme &amp; Web Audio Synthesizer</w:t>
-      </w:r>
-      <w:r>
-        <w:rPr>
-          <w:rFonts w:ascii="Times New Roman" w:hAnsi="Times New Roman"/>
-          <w:color w:val="94A3B8"/>
-          <w:sz w:val="20"/>
-        </w:rPr>
-        <w:t xml:space="preserve"> .. </w:t>
+        <w:t xml:space="preserve">    2.4. Phân hệ Đồ họa 3D Cartoon Theme &amp; Web Audio Synthesizer</w:t>
+      </w:r>
+      <w:r>
+        <w:rPr>
+          <w:rFonts w:ascii="Times New Roman" w:hAnsi="Times New Roman"/>
+        </w:rPr>
+        <w:tab/>
       </w:r>
       <w:r>
         <w:rPr>
           <w:rFonts w:ascii="Times New Roman" w:hAnsi="Times New Roman"/>
           <w:b w:val="0"/>
+          <w:color w:val="000000"/>
           <w:sz w:val="24"/>
         </w:rPr>
         <w:t>10</w:t>
@@ -3236,28 +3270,30 @@
       <w:pPr>
         <w:spacing w:before="40" w:after="60" w:line="276" w:lineRule="auto"/>
         <w:jc w:val="left"/>
+        <w:tabs>
+          <w:tab w:val="right" w:leader="dot" w:pos="9072"/>
+        </w:tabs>
       </w:pPr>
       <w:r>
         <w:rPr>
           <w:rFonts w:ascii="Times New Roman" w:hAnsi="Times New Roman"/>
           <w:b w:val="0"/>
-          <w:color w:val="334155"/>
+          <w:color w:val="000000"/>
           <w:sz w:val="24"/>
         </w:rPr>
-        <w:t xml:space="preserve">   2.5. Phân hệ Quản lý Cơ sở Dữ liệu MySQL &amp; Server Cloud</w:t>
-      </w:r>
-      <w:r>
-        <w:rPr>
-          <w:rFonts w:ascii="Times New Roman" w:hAnsi="Times New Roman"/>
-          <w:color w:val="94A3B8"/>
-          <w:sz w:val="20"/>
-        </w:rPr>
-        <w:t xml:space="preserve"> .. </w:t>
+        <w:t xml:space="preserve">    2.5. Phân hệ Quản lý Cơ sở Dữ liệu MySQL &amp; Server Cloud</w:t>
+      </w:r>
+      <w:r>
+        <w:rPr>
+          <w:rFonts w:ascii="Times New Roman" w:hAnsi="Times New Roman"/>
+        </w:rPr>
+        <w:tab/>
       </w:r>
       <w:r>
         <w:rPr>
           <w:rFonts w:ascii="Times New Roman" w:hAnsi="Times New Roman"/>
           <w:b w:val="0"/>
+          <w:color w:val="000000"/>
           <w:sz w:val="24"/>
         </w:rPr>
         <w:t>10</w:t>
@@ -3267,12 +3303,15 @@
       <w:pPr>
         <w:spacing w:before="40" w:after="60" w:line="276" w:lineRule="auto"/>
         <w:jc w:val="left"/>
-      </w:pPr>
-      <w:r>
-        <w:rPr>
-          <w:rFonts w:ascii="Times New Roman" w:hAnsi="Times New Roman"/>
-          <w:b/>
-          <w:color w:val="0F172A"/>
+        <w:tabs>
+          <w:tab w:val="right" w:leader="dot" w:pos="9072"/>
+        </w:tabs>
+      </w:pPr>
+      <w:r>
+        <w:rPr>
+          <w:rFonts w:ascii="Times New Roman" w:hAnsi="Times New Roman"/>
+          <w:b/>
+          <w:color w:val="000000"/>
           <w:sz w:val="24"/>
         </w:rPr>
         <w:t>CHƯƠNG 3: ĐẶC TẢ SƠ ĐỒ LUỒNG XỬ LÝ (WORKFLOWS)</w:t>
@@ -3280,15 +3319,14 @@
       <w:r>
         <w:rPr>
           <w:rFonts w:ascii="Times New Roman" w:hAnsi="Times New Roman"/>
-          <w:color w:val="94A3B8"/>
-          <w:sz w:val="20"/>
-        </w:rPr>
-        <w:t xml:space="preserve"> .. </w:t>
-      </w:r>
-      <w:r>
-        <w:rPr>
-          <w:rFonts w:ascii="Times New Roman" w:hAnsi="Times New Roman"/>
-          <w:b/>
+        </w:rPr>
+        <w:tab/>
+      </w:r>
+      <w:r>
+        <w:rPr>
+          <w:rFonts w:ascii="Times New Roman" w:hAnsi="Times New Roman"/>
+          <w:b/>
+          <w:color w:val="000000"/>
           <w:sz w:val="24"/>
         </w:rPr>
         <w:t>11</w:t>
@@ -3298,28 +3336,30 @@
       <w:pPr>
         <w:spacing w:before="40" w:after="60" w:line="276" w:lineRule="auto"/>
         <w:jc w:val="left"/>
+        <w:tabs>
+          <w:tab w:val="right" w:leader="dot" w:pos="9072"/>
+        </w:tabs>
       </w:pPr>
       <w:r>
         <w:rPr>
           <w:rFonts w:ascii="Times New Roman" w:hAnsi="Times New Roman"/>
           <w:b w:val="0"/>
-          <w:color w:val="334155"/>
+          <w:color w:val="000000"/>
           <w:sz w:val="24"/>
         </w:rPr>
-        <w:t xml:space="preserve">   3.1. Luồng xử lý của Người chơi Offline</w:t>
-      </w:r>
-      <w:r>
-        <w:rPr>
-          <w:rFonts w:ascii="Times New Roman" w:hAnsi="Times New Roman"/>
-          <w:color w:val="94A3B8"/>
-          <w:sz w:val="20"/>
-        </w:rPr>
-        <w:t xml:space="preserve"> ... </w:t>
+        <w:t xml:space="preserve">    3.1. Luồng xử lý của Người chơi Offline</w:t>
+      </w:r>
+      <w:r>
+        <w:rPr>
+          <w:rFonts w:ascii="Times New Roman" w:hAnsi="Times New Roman"/>
+        </w:rPr>
+        <w:tab/>
       </w:r>
       <w:r>
         <w:rPr>
           <w:rFonts w:ascii="Times New Roman" w:hAnsi="Times New Roman"/>
           <w:b w:val="0"/>
+          <w:color w:val="000000"/>
           <w:sz w:val="24"/>
         </w:rPr>
         <w:t>11</w:t>
@@ -3329,28 +3369,30 @@
       <w:pPr>
         <w:spacing w:before="40" w:after="60" w:line="276" w:lineRule="auto"/>
         <w:jc w:val="left"/>
+        <w:tabs>
+          <w:tab w:val="right" w:leader="dot" w:pos="9072"/>
+        </w:tabs>
       </w:pPr>
       <w:r>
         <w:rPr>
           <w:rFonts w:ascii="Times New Roman" w:hAnsi="Times New Roman"/>
           <w:b w:val="0"/>
-          <w:color w:val="334155"/>
+          <w:color w:val="000000"/>
           <w:sz w:val="24"/>
         </w:rPr>
-        <w:t xml:space="preserve">   3.2. Luồng xử lý của Người chơi Online Đấu trường</w:t>
-      </w:r>
-      <w:r>
-        <w:rPr>
-          <w:rFonts w:ascii="Times New Roman" w:hAnsi="Times New Roman"/>
-          <w:color w:val="94A3B8"/>
-          <w:sz w:val="20"/>
-        </w:rPr>
-        <w:t xml:space="preserve"> .. </w:t>
+        <w:t xml:space="preserve">    3.2. Luồng xử lý của Người chơi Online Đấu trường</w:t>
+      </w:r>
+      <w:r>
+        <w:rPr>
+          <w:rFonts w:ascii="Times New Roman" w:hAnsi="Times New Roman"/>
+        </w:rPr>
+        <w:tab/>
       </w:r>
       <w:r>
         <w:rPr>
           <w:rFonts w:ascii="Times New Roman" w:hAnsi="Times New Roman"/>
           <w:b w:val="0"/>
+          <w:color w:val="000000"/>
           <w:sz w:val="24"/>
         </w:rPr>
         <w:t>11</w:t>
@@ -3360,28 +3402,30 @@
       <w:pPr>
         <w:spacing w:before="40" w:after="60" w:line="276" w:lineRule="auto"/>
         <w:jc w:val="left"/>
+        <w:tabs>
+          <w:tab w:val="right" w:leader="dot" w:pos="9072"/>
+        </w:tabs>
       </w:pPr>
       <w:r>
         <w:rPr>
           <w:rFonts w:ascii="Times New Roman" w:hAnsi="Times New Roman"/>
           <w:b w:val="0"/>
-          <w:color w:val="334155"/>
+          <w:color w:val="000000"/>
           <w:sz w:val="24"/>
         </w:rPr>
-        <w:t xml:space="preserve">   3.3. Luồng xử lý của Người chơi Online Hợp tác</w:t>
-      </w:r>
-      <w:r>
-        <w:rPr>
-          <w:rFonts w:ascii="Times New Roman" w:hAnsi="Times New Roman"/>
-          <w:color w:val="94A3B8"/>
-          <w:sz w:val="20"/>
-        </w:rPr>
-        <w:t xml:space="preserve"> .. </w:t>
+        <w:t xml:space="preserve">    3.3. Luồng xử lý của Người chơi Online Hợp tác</w:t>
+      </w:r>
+      <w:r>
+        <w:rPr>
+          <w:rFonts w:ascii="Times New Roman" w:hAnsi="Times New Roman"/>
+        </w:rPr>
+        <w:tab/>
       </w:r>
       <w:r>
         <w:rPr>
           <w:rFonts w:ascii="Times New Roman" w:hAnsi="Times New Roman"/>
           <w:b w:val="0"/>
+          <w:color w:val="000000"/>
           <w:sz w:val="24"/>
         </w:rPr>
         <w:t>12</w:t>
@@ -3391,12 +3435,15 @@
       <w:pPr>
         <w:spacing w:before="40" w:after="60" w:line="276" w:lineRule="auto"/>
         <w:jc w:val="left"/>
-      </w:pPr>
-      <w:r>
-        <w:rPr>
-          <w:rFonts w:ascii="Times New Roman" w:hAnsi="Times New Roman"/>
-          <w:b/>
-          <w:color w:val="0F172A"/>
+        <w:tabs>
+          <w:tab w:val="right" w:leader="dot" w:pos="9072"/>
+        </w:tabs>
+      </w:pPr>
+      <w:r>
+        <w:rPr>
+          <w:rFonts w:ascii="Times New Roman" w:hAnsi="Times New Roman"/>
+          <w:b/>
+          <w:color w:val="000000"/>
           <w:sz w:val="24"/>
         </w:rPr>
         <w:t>CHƯƠNG 4: THIẾT KẾ CƠ SỞ DỮ LIỆU VÀ MÁY CHỦ MULTIPLAYER</w:t>
@@ -3404,15 +3451,14 @@
       <w:r>
         <w:rPr>
           <w:rFonts w:ascii="Times New Roman" w:hAnsi="Times New Roman"/>
-          <w:color w:val="94A3B8"/>
-          <w:sz w:val="20"/>
-        </w:rPr>
-        <w:t xml:space="preserve"> .. </w:t>
-      </w:r>
-      <w:r>
-        <w:rPr>
-          <w:rFonts w:ascii="Times New Roman" w:hAnsi="Times New Roman"/>
-          <w:b/>
+        </w:rPr>
+        <w:tab/>
+      </w:r>
+      <w:r>
+        <w:rPr>
+          <w:rFonts w:ascii="Times New Roman" w:hAnsi="Times New Roman"/>
+          <w:b/>
+          <w:color w:val="000000"/>
           <w:sz w:val="24"/>
         </w:rPr>
         <w:t>13</w:t>
@@ -3422,28 +3468,30 @@
       <w:pPr>
         <w:spacing w:before="40" w:after="60" w:line="276" w:lineRule="auto"/>
         <w:jc w:val="left"/>
+        <w:tabs>
+          <w:tab w:val="right" w:leader="dot" w:pos="9072"/>
+        </w:tabs>
       </w:pPr>
       <w:r>
         <w:rPr>
           <w:rFonts w:ascii="Times New Roman" w:hAnsi="Times New Roman"/>
           <w:b w:val="0"/>
-          <w:color w:val="334155"/>
+          <w:color w:val="000000"/>
           <w:sz w:val="24"/>
         </w:rPr>
-        <w:t xml:space="preserve">   4.1. Cấu trúc Thực thể Cơ sở Dữ liệu (Database Schema)</w:t>
-      </w:r>
-      <w:r>
-        <w:rPr>
-          <w:rFonts w:ascii="Times New Roman" w:hAnsi="Times New Roman"/>
-          <w:color w:val="94A3B8"/>
-          <w:sz w:val="20"/>
-        </w:rPr>
-        <w:t xml:space="preserve"> .. </w:t>
+        <w:t xml:space="preserve">    4.1. Cấu trúc Thực thể Cơ sở Dữ liệu (Database Schema)</w:t>
+      </w:r>
+      <w:r>
+        <w:rPr>
+          <w:rFonts w:ascii="Times New Roman" w:hAnsi="Times New Roman"/>
+        </w:rPr>
+        <w:tab/>
       </w:r>
       <w:r>
         <w:rPr>
           <w:rFonts w:ascii="Times New Roman" w:hAnsi="Times New Roman"/>
           <w:b w:val="0"/>
+          <w:color w:val="000000"/>
           <w:sz w:val="24"/>
         </w:rPr>
         <w:t>13</w:t>
@@ -3453,28 +3501,30 @@
       <w:pPr>
         <w:spacing w:before="40" w:after="60" w:line="276" w:lineRule="auto"/>
         <w:jc w:val="left"/>
+        <w:tabs>
+          <w:tab w:val="right" w:leader="dot" w:pos="9072"/>
+        </w:tabs>
       </w:pPr>
       <w:r>
         <w:rPr>
           <w:rFonts w:ascii="Times New Roman" w:hAnsi="Times New Roman"/>
           <w:b w:val="0"/>
-          <w:color w:val="334155"/>
+          <w:color w:val="000000"/>
           <w:sz w:val="24"/>
         </w:rPr>
-        <w:t xml:space="preserve">   4.2. Đặc tả Chi tiết các Bảng CSDL Cốt lõi</w:t>
-      </w:r>
-      <w:r>
-        <w:rPr>
-          <w:rFonts w:ascii="Times New Roman" w:hAnsi="Times New Roman"/>
-          <w:color w:val="94A3B8"/>
-          <w:sz w:val="20"/>
-        </w:rPr>
-        <w:t xml:space="preserve"> .. </w:t>
+        <w:t xml:space="preserve">    4.2. Đặc tả Chi tiết các Bảng CSDL Cốt lõi</w:t>
+      </w:r>
+      <w:r>
+        <w:rPr>
+          <w:rFonts w:ascii="Times New Roman" w:hAnsi="Times New Roman"/>
+        </w:rPr>
+        <w:tab/>
       </w:r>
       <w:r>
         <w:rPr>
           <w:rFonts w:ascii="Times New Roman" w:hAnsi="Times New Roman"/>
           <w:b w:val="0"/>
+          <w:color w:val="000000"/>
           <w:sz w:val="24"/>
         </w:rPr>
         <w:t>13</w:t>
@@ -3484,28 +3534,30 @@
       <w:pPr>
         <w:spacing w:before="40" w:after="60" w:line="276" w:lineRule="auto"/>
         <w:jc w:val="left"/>
+        <w:tabs>
+          <w:tab w:val="right" w:leader="dot" w:pos="9072"/>
+        </w:tabs>
       </w:pPr>
       <w:r>
         <w:rPr>
           <w:rFonts w:ascii="Times New Roman" w:hAnsi="Times New Roman"/>
           <w:b w:val="0"/>
-          <w:color w:val="334155"/>
+          <w:color w:val="000000"/>
           <w:sz w:val="24"/>
         </w:rPr>
-        <w:t xml:space="preserve">   4.3. Xử lý các Tình huống Vận hành Thực tế</w:t>
-      </w:r>
-      <w:r>
-        <w:rPr>
-          <w:rFonts w:ascii="Times New Roman" w:hAnsi="Times New Roman"/>
-          <w:color w:val="94A3B8"/>
-          <w:sz w:val="20"/>
-        </w:rPr>
-        <w:t xml:space="preserve"> .. </w:t>
+        <w:t xml:space="preserve">    4.3. Xử lý các Tình huống Vận hành Thực tế</w:t>
+      </w:r>
+      <w:r>
+        <w:rPr>
+          <w:rFonts w:ascii="Times New Roman" w:hAnsi="Times New Roman"/>
+        </w:rPr>
+        <w:tab/>
       </w:r>
       <w:r>
         <w:rPr>
           <w:rFonts w:ascii="Times New Roman" w:hAnsi="Times New Roman"/>
           <w:b w:val="0"/>
+          <w:color w:val="000000"/>
           <w:sz w:val="24"/>
         </w:rPr>
         <w:t>14</w:t>
@@ -3515,12 +3567,15 @@
       <w:pPr>
         <w:spacing w:before="40" w:after="60" w:line="276" w:lineRule="auto"/>
         <w:jc w:val="left"/>
-      </w:pPr>
-      <w:r>
-        <w:rPr>
-          <w:rFonts w:ascii="Times New Roman" w:hAnsi="Times New Roman"/>
-          <w:b/>
-          <w:color w:val="0F172A"/>
+        <w:tabs>
+          <w:tab w:val="right" w:leader="dot" w:pos="9072"/>
+        </w:tabs>
+      </w:pPr>
+      <w:r>
+        <w:rPr>
+          <w:rFonts w:ascii="Times New Roman" w:hAnsi="Times New Roman"/>
+          <w:b/>
+          <w:color w:val="000000"/>
           <w:sz w:val="24"/>
         </w:rPr>
         <w:t>CHƯƠNG 5: THIẾT LẬP CÔNG NGHỆ VÀ TRIỂN KHAI CLOUD</w:t>
@@ -3528,15 +3583,14 @@
       <w:r>
         <w:rPr>
           <w:rFonts w:ascii="Times New Roman" w:hAnsi="Times New Roman"/>
-          <w:color w:val="94A3B8"/>
-          <w:sz w:val="20"/>
-        </w:rPr>
-        <w:t xml:space="preserve"> .. </w:t>
-      </w:r>
-      <w:r>
-        <w:rPr>
-          <w:rFonts w:ascii="Times New Roman" w:hAnsi="Times New Roman"/>
-          <w:b/>
+        </w:rPr>
+        <w:tab/>
+      </w:r>
+      <w:r>
+        <w:rPr>
+          <w:rFonts w:ascii="Times New Roman" w:hAnsi="Times New Roman"/>
+          <w:b/>
+          <w:color w:val="000000"/>
           <w:sz w:val="24"/>
         </w:rPr>
         <w:t>15</w:t>
@@ -3546,28 +3600,30 @@
       <w:pPr>
         <w:spacing w:before="40" w:after="60" w:line="276" w:lineRule="auto"/>
         <w:jc w:val="left"/>
+        <w:tabs>
+          <w:tab w:val="right" w:leader="dot" w:pos="9072"/>
+        </w:tabs>
       </w:pPr>
       <w:r>
         <w:rPr>
           <w:rFonts w:ascii="Times New Roman" w:hAnsi="Times New Roman"/>
           <w:b w:val="0"/>
-          <w:color w:val="334155"/>
+          <w:color w:val="000000"/>
           <w:sz w:val="24"/>
         </w:rPr>
-        <w:t xml:space="preserve">   5.1. Công nghệ Frontend UI Engine</w:t>
-      </w:r>
-      <w:r>
-        <w:rPr>
-          <w:rFonts w:ascii="Times New Roman" w:hAnsi="Times New Roman"/>
-          <w:color w:val="94A3B8"/>
-          <w:sz w:val="20"/>
-        </w:rPr>
-        <w:t xml:space="preserve"> ......... </w:t>
+        <w:t xml:space="preserve">    5.1. Công nghệ Frontend UI Engine</w:t>
+      </w:r>
+      <w:r>
+        <w:rPr>
+          <w:rFonts w:ascii="Times New Roman" w:hAnsi="Times New Roman"/>
+        </w:rPr>
+        <w:tab/>
       </w:r>
       <w:r>
         <w:rPr>
           <w:rFonts w:ascii="Times New Roman" w:hAnsi="Times New Roman"/>
           <w:b w:val="0"/>
+          <w:color w:val="000000"/>
           <w:sz w:val="24"/>
         </w:rPr>
         <w:t>15</w:t>
@@ -3577,28 +3633,30 @@
       <w:pPr>
         <w:spacing w:before="40" w:after="60" w:line="276" w:lineRule="auto"/>
         <w:jc w:val="left"/>
+        <w:tabs>
+          <w:tab w:val="right" w:leader="dot" w:pos="9072"/>
+        </w:tabs>
       </w:pPr>
       <w:r>
         <w:rPr>
           <w:rFonts w:ascii="Times New Roman" w:hAnsi="Times New Roman"/>
           <w:b w:val="0"/>
-          <w:color w:val="334155"/>
+          <w:color w:val="000000"/>
           <w:sz w:val="24"/>
         </w:rPr>
-        <w:t xml:space="preserve">   5.2. Công nghệ Backend Engine &amp; WebSockets</w:t>
-      </w:r>
-      <w:r>
-        <w:rPr>
-          <w:rFonts w:ascii="Times New Roman" w:hAnsi="Times New Roman"/>
-          <w:color w:val="94A3B8"/>
-          <w:sz w:val="20"/>
-        </w:rPr>
-        <w:t xml:space="preserve"> .. </w:t>
+        <w:t xml:space="preserve">    5.2. Công nghệ Backend Engine &amp; WebSockets</w:t>
+      </w:r>
+      <w:r>
+        <w:rPr>
+          <w:rFonts w:ascii="Times New Roman" w:hAnsi="Times New Roman"/>
+        </w:rPr>
+        <w:tab/>
       </w:r>
       <w:r>
         <w:rPr>
           <w:rFonts w:ascii="Times New Roman" w:hAnsi="Times New Roman"/>
           <w:b w:val="0"/>
+          <w:color w:val="000000"/>
           <w:sz w:val="24"/>
         </w:rPr>
         <w:t>15</w:t>
@@ -3608,28 +3666,30 @@
       <w:pPr>
         <w:spacing w:before="40" w:after="60" w:line="276" w:lineRule="auto"/>
         <w:jc w:val="left"/>
+        <w:tabs>
+          <w:tab w:val="right" w:leader="dot" w:pos="9072"/>
+        </w:tabs>
       </w:pPr>
       <w:r>
         <w:rPr>
           <w:rFonts w:ascii="Times New Roman" w:hAnsi="Times New Roman"/>
           <w:b w:val="0"/>
-          <w:color w:val="334155"/>
+          <w:color w:val="000000"/>
           <w:sz w:val="24"/>
         </w:rPr>
-        <w:t xml:space="preserve">   5.3. Môi trường Triển khai Production Cloud</w:t>
-      </w:r>
-      <w:r>
-        <w:rPr>
-          <w:rFonts w:ascii="Times New Roman" w:hAnsi="Times New Roman"/>
-          <w:color w:val="94A3B8"/>
-          <w:sz w:val="20"/>
-        </w:rPr>
-        <w:t xml:space="preserve"> .. </w:t>
+        <w:t xml:space="preserve">    5.3. Môi trường Triển khai Production Cloud</w:t>
+      </w:r>
+      <w:r>
+        <w:rPr>
+          <w:rFonts w:ascii="Times New Roman" w:hAnsi="Times New Roman"/>
+        </w:rPr>
+        <w:tab/>
       </w:r>
       <w:r>
         <w:rPr>
           <w:rFonts w:ascii="Times New Roman" w:hAnsi="Times New Roman"/>
           <w:b w:val="0"/>
+          <w:color w:val="000000"/>
           <w:sz w:val="24"/>
         </w:rPr>
         <w:t>16</w:t>
@@ -3639,12 +3699,15 @@
       <w:pPr>
         <w:spacing w:before="40" w:after="60" w:line="276" w:lineRule="auto"/>
         <w:jc w:val="left"/>
-      </w:pPr>
-      <w:r>
-        <w:rPr>
-          <w:rFonts w:ascii="Times New Roman" w:hAnsi="Times New Roman"/>
-          <w:b/>
-          <w:color w:val="0F172A"/>
+        <w:tabs>
+          <w:tab w:val="right" w:leader="dot" w:pos="9072"/>
+        </w:tabs>
+      </w:pPr>
+      <w:r>
+        <w:rPr>
+          <w:rFonts w:ascii="Times New Roman" w:hAnsi="Times New Roman"/>
+          <w:b/>
+          <w:color w:val="000000"/>
           <w:sz w:val="24"/>
         </w:rPr>
         <w:t>KẾT LUẬN VÀ HƯỚNG PHÁT TRIỂN</w:t>
@@ -3652,15 +3715,14 @@
       <w:r>
         <w:rPr>
           <w:rFonts w:ascii="Times New Roman" w:hAnsi="Times New Roman"/>
-          <w:color w:val="94A3B8"/>
-          <w:sz w:val="20"/>
-        </w:rPr>
-        <w:t xml:space="preserve"> ................. </w:t>
-      </w:r>
-      <w:r>
-        <w:rPr>
-          <w:rFonts w:ascii="Times New Roman" w:hAnsi="Times New Roman"/>
-          <w:b/>
+        </w:rPr>
+        <w:tab/>
+      </w:r>
+      <w:r>
+        <w:rPr>
+          <w:rFonts w:ascii="Times New Roman" w:hAnsi="Times New Roman"/>
+          <w:b/>
+          <w:color w:val="000000"/>
           <w:sz w:val="24"/>
         </w:rPr>
         <w:t>17</w:t>
@@ -3681,16 +3743,16 @@
         <w:rPr>
           <w:rFonts w:ascii="Times New Roman" w:hAnsi="Times New Roman"/>
           <w:b/>
-          <w:color w:val="7C3AED"/>
-          <w:sz w:val="32"/>
+          <w:color w:val="000000"/>
+          <w:sz w:val="30"/>
         </w:rPr>
         <w:t>MỞ ĐẦU</w:t>
       </w:r>
     </w:p>
     <w:p>
       <w:pPr>
-        <w:spacing w:before="40" w:after="100" w:line="288" w:lineRule="auto"/>
-        <w:ind w:firstLine="432"/>
+        <w:spacing w:before="40" w:after="80" w:line="288" w:lineRule="auto"/>
+        <w:ind w:firstLine="720"/>
         <w:jc w:val="both"/>
       </w:pPr>
       <w:r>
@@ -3698,7 +3760,7 @@
           <w:rFonts w:ascii="Times New Roman" w:hAnsi="Times New Roman"/>
           <w:b w:val="0"/>
           <w:i w:val="0"/>
-          <w:color w:val="1E293B"/>
+          <w:color w:val="000000"/>
           <w:sz w:val="26"/>
         </w:rPr>
         <w:t>Trong kỷ nguyên số hóa hiện nay, ngành công nghiệp giải trí kỹ thuật số và phát triển Game Web trên nền tảng JavaScript đang bùng nổ mạnh mẽ nhờ tính linh hoạt, khả năng tương thích cao trên mọi thiết bị di động cũng như máy tính mà không cần cài đặt phức tạp. Dòng game Clicker (Idle Clicker Game) từ lâu đã trở thành một hiện tượng thu hút hàng triệu người chơi nhờ lối chơi đơn giản nhưng cực kỳ cuốn hút, giúp giải tỏa căng thẳng nhanh chóng.</w:t>
@@ -3706,8 +3768,8 @@
     </w:p>
     <w:p>
       <w:pPr>
-        <w:spacing w:before="40" w:after="100" w:line="288" w:lineRule="auto"/>
-        <w:ind w:firstLine="432"/>
+        <w:spacing w:before="40" w:after="80" w:line="288" w:lineRule="auto"/>
+        <w:ind w:firstLine="720"/>
         <w:jc w:val="both"/>
       </w:pPr>
       <w:r>
@@ -3715,7 +3777,7 @@
           <w:rFonts w:ascii="Times New Roman" w:hAnsi="Times New Roman"/>
           <w:b w:val="0"/>
           <w:i w:val="0"/>
-          <w:color w:val="1E293B"/>
+          <w:color w:val="000000"/>
           <w:sz w:val="26"/>
         </w:rPr>
         <w:t>Tuy nhiên, phần lớn các tựa game Clicker truyền thống hiện nay chỉ dừng lại ở chế độ chơi đơn (Offline) thụ động, thiếu tính kết nối cộng đồng và dễ gây cảm giác nhàm chán sau một thời gian ngắn. Xuất phát từ nhu cầu thực tiễn đó, nhóm em đã lựa chọn đề tài "Phân tích thiết kế và xây dựng Game Siêu Clicker Tam Hợp (Tap Tap Clicker Multiplayer)" để tạo ra một sản phẩm game Web hiện đại, kết hợp hài hòa giữa tính năng chơi đơn tích lũy và chế độ thi đấu/hợp tác trực tuyến đa người chơi (Real-time Multiplayer) thông qua công nghệ WebSocket tiên tiến.</w:t>
@@ -3731,8 +3793,8 @@
         <w:rPr>
           <w:rFonts w:ascii="Times New Roman" w:hAnsi="Times New Roman"/>
           <w:b/>
-          <w:color w:val="7C3AED"/>
-          <w:sz w:val="32"/>
+          <w:color w:val="000000"/>
+          <w:sz w:val="30"/>
         </w:rPr>
         <w:t>CHƯƠNG 1: GIỚI THIỆU ĐỀ TÀI GAME CLICKER</w:t>
       </w:r>
@@ -3747,16 +3809,16 @@
         <w:rPr>
           <w:rFonts w:ascii="Times New Roman" w:hAnsi="Times New Roman"/>
           <w:b/>
-          <w:color w:val="0F172A"/>
-          <w:sz w:val="28"/>
+          <w:color w:val="000000"/>
+          <w:sz w:val="27"/>
         </w:rPr>
         <w:t>1.1. Bối cảnh và Tính cấp thiết của Đề tài</w:t>
       </w:r>
     </w:p>
     <w:p>
       <w:pPr>
-        <w:spacing w:before="40" w:after="100" w:line="288" w:lineRule="auto"/>
-        <w:ind w:firstLine="432"/>
+        <w:spacing w:before="40" w:after="80" w:line="288" w:lineRule="auto"/>
+        <w:ind w:firstLine="720"/>
         <w:jc w:val="both"/>
       </w:pPr>
       <w:r>
@@ -3764,7 +3826,7 @@
           <w:rFonts w:ascii="Times New Roman" w:hAnsi="Times New Roman"/>
           <w:b w:val="0"/>
           <w:i w:val="0"/>
-          <w:color w:val="1E293B"/>
+          <w:color w:val="000000"/>
           <w:sz w:val="26"/>
         </w:rPr>
         <w:t>Ngành game Web hiện đại đòi hỏi sự đổi mới không ngừng về trải nghiệm người dùng. Việc kết hợp cơ chế Click tích lũy điểm số truyền thống với các công nghệ giao tiếp thời gian thực đem lại sự đột phá lớn trong tương tác nhóm.</w:t>
@@ -3773,14 +3835,15 @@
     <w:p>
       <w:pPr>
         <w:pStyle w:val="ListParagraph"/>
-        <w:spacing w:before="40" w:after="80" w:line="283" w:lineRule="auto"/>
-        <w:ind w:left="360"/>
+        <w:spacing w:before="40" w:after="80" w:line="288" w:lineRule="auto"/>
+        <w:ind w:left="432"/>
         <w:jc w:val="both"/>
       </w:pPr>
       <w:r>
         <w:rPr>
           <w:rFonts w:ascii="Times New Roman" w:hAnsi="Times New Roman"/>
-          <w:color w:val="7C3AED"/>
+          <w:b/>
+          <w:color w:val="000000"/>
           <w:sz w:val="26"/>
         </w:rPr>
         <w:t xml:space="preserve">•  </w:t>
@@ -3789,7 +3852,7 @@
         <w:rPr>
           <w:rFonts w:ascii="Times New Roman" w:hAnsi="Times New Roman"/>
           <w:b/>
-          <w:color w:val="0F172A"/>
+          <w:color w:val="000000"/>
           <w:sz w:val="26"/>
         </w:rPr>
         <w:t xml:space="preserve">Hạn chế của game truyền thống: </w:t>
@@ -3797,7 +3860,7 @@
       <w:r>
         <w:rPr>
           <w:rFonts w:ascii="Times New Roman" w:hAnsi="Times New Roman"/>
-          <w:color w:val="1E293B"/>
+          <w:color w:val="000000"/>
           <w:sz w:val="26"/>
         </w:rPr>
         <w:t>Các game Web Clicker thông thường chỉ cho phép người chơi tương tác một mình, thiếu tính cạnh tranh và giao lưu.</w:t>
@@ -3806,14 +3869,15 @@
     <w:p>
       <w:pPr>
         <w:pStyle w:val="ListParagraph"/>
-        <w:spacing w:before="40" w:after="80" w:line="283" w:lineRule="auto"/>
-        <w:ind w:left="360"/>
+        <w:spacing w:before="40" w:after="80" w:line="288" w:lineRule="auto"/>
+        <w:ind w:left="432"/>
         <w:jc w:val="both"/>
       </w:pPr>
       <w:r>
         <w:rPr>
           <w:rFonts w:ascii="Times New Roman" w:hAnsi="Times New Roman"/>
-          <w:color w:val="7C3AED"/>
+          <w:b/>
+          <w:color w:val="000000"/>
           <w:sz w:val="26"/>
         </w:rPr>
         <w:t xml:space="preserve">•  </w:t>
@@ -3822,7 +3886,7 @@
         <w:rPr>
           <w:rFonts w:ascii="Times New Roman" w:hAnsi="Times New Roman"/>
           <w:b/>
-          <w:color w:val="0F172A"/>
+          <w:color w:val="000000"/>
           <w:sz w:val="26"/>
         </w:rPr>
         <w:t xml:space="preserve">Ứng dụng công nghệ JavaScript mới: </w:t>
@@ -3830,7 +3894,7 @@
       <w:r>
         <w:rPr>
           <w:rFonts w:ascii="Times New Roman" w:hAnsi="Times New Roman"/>
-          <w:color w:val="1E293B"/>
+          <w:color w:val="000000"/>
           <w:sz w:val="26"/>
         </w:rPr>
         <w:t>Ứng dụng bộ công cụ tiên tiến React 19, Vite, Node.js, Socket.io và cơ sở dữ liệu MySQL để xây dựng hạ tầng game đa người chơi hoàn chỉnh.</w:t>
@@ -3846,8 +3910,8 @@
         <w:rPr>
           <w:rFonts w:ascii="Times New Roman" w:hAnsi="Times New Roman"/>
           <w:b/>
-          <w:color w:val="0F172A"/>
-          <w:sz w:val="28"/>
+          <w:color w:val="000000"/>
+          <w:sz w:val="27"/>
         </w:rPr>
         <w:t>1.2. Mục tiêu nghiên cứu và Xây dựng Game</w:t>
       </w:r>
@@ -3855,14 +3919,15 @@
     <w:p>
       <w:pPr>
         <w:pStyle w:val="ListParagraph"/>
-        <w:spacing w:before="40" w:after="80" w:line="283" w:lineRule="auto"/>
-        <w:ind w:left="360"/>
+        <w:spacing w:before="40" w:after="80" w:line="288" w:lineRule="auto"/>
+        <w:ind w:left="432"/>
         <w:jc w:val="both"/>
       </w:pPr>
       <w:r>
         <w:rPr>
           <w:rFonts w:ascii="Times New Roman" w:hAnsi="Times New Roman"/>
-          <w:color w:val="7C3AED"/>
+          <w:b/>
+          <w:color w:val="000000"/>
           <w:sz w:val="26"/>
         </w:rPr>
         <w:t xml:space="preserve">•  </w:t>
@@ -3871,7 +3936,7 @@
         <w:rPr>
           <w:rFonts w:ascii="Times New Roman" w:hAnsi="Times New Roman"/>
           <w:b/>
-          <w:color w:val="0F172A"/>
+          <w:color w:val="000000"/>
           <w:sz w:val="26"/>
         </w:rPr>
         <w:t xml:space="preserve">Xây dựng giao diện đồ họa sống động: </w:t>
@@ -3879,7 +3944,7 @@
       <w:r>
         <w:rPr>
           <w:rFonts w:ascii="Times New Roman" w:hAnsi="Times New Roman"/>
-          <w:color w:val="1E293B"/>
+          <w:color w:val="000000"/>
           <w:sz w:val="26"/>
         </w:rPr>
         <w:t>Thiết kế giao diện người dùng đẹp mắt, hiện đại theo phong cách Glassmorphism với hiệu ứng vầng ánh sáng mặt trời xoay (Sunburst Rays).</w:t>
@@ -3888,14 +3953,15 @@
     <w:p>
       <w:pPr>
         <w:pStyle w:val="ListParagraph"/>
-        <w:spacing w:before="40" w:after="80" w:line="283" w:lineRule="auto"/>
-        <w:ind w:left="360"/>
+        <w:spacing w:before="40" w:after="80" w:line="288" w:lineRule="auto"/>
+        <w:ind w:left="432"/>
         <w:jc w:val="both"/>
       </w:pPr>
       <w:r>
         <w:rPr>
           <w:rFonts w:ascii="Times New Roman" w:hAnsi="Times New Roman"/>
-          <w:color w:val="7C3AED"/>
+          <w:b/>
+          <w:color w:val="000000"/>
           <w:sz w:val="26"/>
         </w:rPr>
         <w:t xml:space="preserve">•  </w:t>
@@ -3904,7 +3970,7 @@
         <w:rPr>
           <w:rFonts w:ascii="Times New Roman" w:hAnsi="Times New Roman"/>
           <w:b/>
-          <w:color w:val="0F172A"/>
+          <w:color w:val="000000"/>
           <w:sz w:val="26"/>
         </w:rPr>
         <w:t xml:space="preserve">Đa dạng chế độ chơi: </w:t>
@@ -3912,7 +3978,7 @@
       <w:r>
         <w:rPr>
           <w:rFonts w:ascii="Times New Roman" w:hAnsi="Times New Roman"/>
-          <w:color w:val="1E293B"/>
+          <w:color w:val="000000"/>
           <w:sz w:val="26"/>
         </w:rPr>
         <w:t>Phát triển 3 chế độ chơi gồm: Ngoại tuyến (Offline), Trực tuyến Đấu trường (Competitive 1v1v1) và Trực tuyến Hợp tác (Co-op 3 người).</w:t>
@@ -3921,14 +3987,15 @@
     <w:p>
       <w:pPr>
         <w:pStyle w:val="ListParagraph"/>
-        <w:spacing w:before="40" w:after="80" w:line="283" w:lineRule="auto"/>
-        <w:ind w:left="360"/>
+        <w:spacing w:before="40" w:after="80" w:line="288" w:lineRule="auto"/>
+        <w:ind w:left="432"/>
         <w:jc w:val="both"/>
       </w:pPr>
       <w:r>
         <w:rPr>
           <w:rFonts w:ascii="Times New Roman" w:hAnsi="Times New Roman"/>
-          <w:color w:val="7C3AED"/>
+          <w:b/>
+          <w:color w:val="000000"/>
           <w:sz w:val="26"/>
         </w:rPr>
         <w:t xml:space="preserve">•  </w:t>
@@ -3937,7 +4004,7 @@
         <w:rPr>
           <w:rFonts w:ascii="Times New Roman" w:hAnsi="Times New Roman"/>
           <w:b/>
-          <w:color w:val="0F172A"/>
+          <w:color w:val="000000"/>
           <w:sz w:val="26"/>
         </w:rPr>
         <w:t xml:space="preserve">Tối ưu hóa âm thanh Web Audio API: </w:t>
@@ -3945,7 +4012,7 @@
       <w:r>
         <w:rPr>
           <w:rFonts w:ascii="Times New Roman" w:hAnsi="Times New Roman"/>
-          <w:color w:val="1E293B"/>
+          <w:color w:val="000000"/>
           <w:sz w:val="26"/>
         </w:rPr>
         <w:t>Xây dựng bộ tổng hợp âm thanh Web Audio API thuần bằng code mà không cần tải các file âm thanh bên ngoài.</w:t>
@@ -3961,16 +4028,16 @@
         <w:rPr>
           <w:rFonts w:ascii="Times New Roman" w:hAnsi="Times New Roman"/>
           <w:b/>
-          <w:color w:val="0F172A"/>
-          <w:sz w:val="28"/>
+          <w:color w:val="000000"/>
+          <w:sz w:val="27"/>
         </w:rPr>
         <w:t>1.3. Lợi ích và Phạm vi ứng dụng của Sản phẩm</w:t>
       </w:r>
     </w:p>
     <w:p>
       <w:pPr>
-        <w:spacing w:before="40" w:after="100" w:line="288" w:lineRule="auto"/>
-        <w:ind w:firstLine="432"/>
+        <w:spacing w:before="40" w:after="80" w:line="288" w:lineRule="auto"/>
+        <w:ind w:firstLine="720"/>
         <w:jc w:val="both"/>
       </w:pPr>
       <w:r>
@@ -3978,7 +4045,7 @@
           <w:rFonts w:ascii="Times New Roman" w:hAnsi="Times New Roman"/>
           <w:b w:val="0"/>
           <w:i w:val="0"/>
-          <w:color w:val="1E293B"/>
+          <w:color w:val="000000"/>
           <w:sz w:val="26"/>
         </w:rPr>
         <w:t>Sản phẩm đáp ứng nhu cầu giải trí nhanh trên mọi nền tảng trình duyệt Web. Người chơi có thể lưu trữ tiến trình chơi cá nhân mượt mà hoặc kết nối thi đấu trực tiếp với bạn bè qua mạng Internet mà không gặp rào cản cài đặt.</w:t>
@@ -3994,16 +4061,16 @@
         <w:rPr>
           <w:rFonts w:ascii="Times New Roman" w:hAnsi="Times New Roman"/>
           <w:b/>
-          <w:color w:val="7C3AED"/>
-          <w:sz w:val="32"/>
+          <w:color w:val="000000"/>
+          <w:sz w:val="30"/>
         </w:rPr>
         <w:t>CHƯƠNG 2: PHÂN TÍCH VÀ THIẾT KẾ HỆ THỐNG GAME</w:t>
       </w:r>
     </w:p>
     <w:p>
       <w:pPr>
-        <w:spacing w:before="40" w:after="100" w:line="288" w:lineRule="auto"/>
-        <w:ind w:firstLine="432"/>
+        <w:spacing w:before="40" w:after="80" w:line="288" w:lineRule="auto"/>
+        <w:ind w:firstLine="720"/>
         <w:jc w:val="both"/>
       </w:pPr>
       <w:r>
@@ -4011,7 +4078,7 @@
           <w:rFonts w:ascii="Times New Roman" w:hAnsi="Times New Roman"/>
           <w:b w:val="0"/>
           <w:i w:val="0"/>
-          <w:color w:val="1E293B"/>
+          <w:color w:val="000000"/>
           <w:sz w:val="26"/>
         </w:rPr>
         <w:t>Hệ thống Siêu Clicker Tam Hợp được phân chia thành các phân hệ chức năng độc lập, hỗ trợ linh hoạt cả hai chế độ chơi Ngoại tuyến và Trực tuyến:</w:t>
@@ -4027,8 +4094,8 @@
         <w:rPr>
           <w:rFonts w:ascii="Times New Roman" w:hAnsi="Times New Roman"/>
           <w:b/>
-          <w:color w:val="0F172A"/>
-          <w:sz w:val="28"/>
+          <w:color w:val="000000"/>
+          <w:sz w:val="27"/>
         </w:rPr>
         <w:t>2.1. Phân hệ Chế độ Chơi Ngoại tuyến (Offline Mode)</w:t>
       </w:r>
@@ -4036,14 +4103,15 @@
     <w:p>
       <w:pPr>
         <w:pStyle w:val="ListParagraph"/>
-        <w:spacing w:before="40" w:after="80" w:line="283" w:lineRule="auto"/>
-        <w:ind w:left="360"/>
+        <w:spacing w:before="40" w:after="80" w:line="288" w:lineRule="auto"/>
+        <w:ind w:left="432"/>
         <w:jc w:val="both"/>
       </w:pPr>
       <w:r>
         <w:rPr>
           <w:rFonts w:ascii="Times New Roman" w:hAnsi="Times New Roman"/>
-          <w:color w:val="7C3AED"/>
+          <w:b/>
+          <w:color w:val="000000"/>
           <w:sz w:val="26"/>
         </w:rPr>
         <w:t xml:space="preserve">•  </w:t>
@@ -4052,7 +4120,7 @@
         <w:rPr>
           <w:rFonts w:ascii="Times New Roman" w:hAnsi="Times New Roman"/>
           <w:b/>
-          <w:color w:val="0F172A"/>
+          <w:color w:val="000000"/>
           <w:sz w:val="26"/>
         </w:rPr>
         <w:t xml:space="preserve">Cơ chế Click tay (Manual Tapping): </w:t>
@@ -4060,7 +4128,7 @@
       <w:r>
         <w:rPr>
           <w:rFonts w:ascii="Times New Roman" w:hAnsi="Times New Roman"/>
-          <w:color w:val="1E293B"/>
+          <w:color w:val="000000"/>
           <w:sz w:val="26"/>
         </w:rPr>
         <w:t>Người chơi nhấp chuột vào linh vật 3D để tạo điểm và tăng chỉ số DPC (Damage Per Click).</w:t>
@@ -4069,14 +4137,15 @@
     <w:p>
       <w:pPr>
         <w:pStyle w:val="ListParagraph"/>
-        <w:spacing w:before="40" w:after="80" w:line="283" w:lineRule="auto"/>
-        <w:ind w:left="360"/>
+        <w:spacing w:before="40" w:after="80" w:line="288" w:lineRule="auto"/>
+        <w:ind w:left="432"/>
         <w:jc w:val="both"/>
       </w:pPr>
       <w:r>
         <w:rPr>
           <w:rFonts w:ascii="Times New Roman" w:hAnsi="Times New Roman"/>
-          <w:color w:val="7C3AED"/>
+          <w:b/>
+          <w:color w:val="000000"/>
           <w:sz w:val="26"/>
         </w:rPr>
         <w:t xml:space="preserve">•  </w:t>
@@ -4085,7 +4154,7 @@
         <w:rPr>
           <w:rFonts w:ascii="Times New Roman" w:hAnsi="Times New Roman"/>
           <w:b/>
-          <w:color w:val="0F172A"/>
+          <w:color w:val="000000"/>
           <w:sz w:val="26"/>
         </w:rPr>
         <w:t xml:space="preserve">Hệ thống Nâng cấp tự động (Auto Helpers): </w:t>
@@ -4093,7 +4162,7 @@
       <w:r>
         <w:rPr>
           <w:rFonts w:ascii="Times New Roman" w:hAnsi="Times New Roman"/>
-          <w:color w:val="1E293B"/>
+          <w:color w:val="000000"/>
           <w:sz w:val="26"/>
         </w:rPr>
         <w:t>Thuê các công cụ hỗ trợ tự động (Găng tay sắt, Rìu chặt củi, Kiếm kim cương, Xe goòng mỏ, Máy khoan laze, Giàn khoan) để tăng nguồn thu nhập DPS (Damage Per Second).</w:t>
@@ -4102,14 +4171,15 @@
     <w:p>
       <w:pPr>
         <w:pStyle w:val="ListParagraph"/>
-        <w:spacing w:before="40" w:after="80" w:line="283" w:lineRule="auto"/>
-        <w:ind w:left="360"/>
+        <w:spacing w:before="40" w:after="80" w:line="288" w:lineRule="auto"/>
+        <w:ind w:left="432"/>
         <w:jc w:val="both"/>
       </w:pPr>
       <w:r>
         <w:rPr>
           <w:rFonts w:ascii="Times New Roman" w:hAnsi="Times New Roman"/>
-          <w:color w:val="7C3AED"/>
+          <w:b/>
+          <w:color w:val="000000"/>
           <w:sz w:val="26"/>
         </w:rPr>
         <w:t xml:space="preserve">•  </w:t>
@@ -4118,7 +4188,7 @@
         <w:rPr>
           <w:rFonts w:ascii="Times New Roman" w:hAnsi="Times New Roman"/>
           <w:b/>
-          <w:color w:val="0F172A"/>
+          <w:color w:val="000000"/>
           <w:sz w:val="26"/>
         </w:rPr>
         <w:t xml:space="preserve">Hệ thống Trùng Sinh (Prestige/Rebirth): </w:t>
@@ -4126,7 +4196,7 @@
       <w:r>
         <w:rPr>
           <w:rFonts w:ascii="Times New Roman" w:hAnsi="Times New Roman"/>
-          <w:color w:val="1E293B"/>
+          <w:color w:val="000000"/>
           <w:sz w:val="26"/>
         </w:rPr>
         <w:t>Khi đạt 50,000 vàng, người chơi thực hiện Trùng Sinh để đổi lấy Tinh Thể Linh Hồn (Soul Crystals), gia tăng vĩnh viễn +15% chỉ số.</w:t>
@@ -4135,14 +4205,15 @@
     <w:p>
       <w:pPr>
         <w:pStyle w:val="ListParagraph"/>
-        <w:spacing w:before="40" w:after="80" w:line="283" w:lineRule="auto"/>
-        <w:ind w:left="360"/>
+        <w:spacing w:before="40" w:after="80" w:line="288" w:lineRule="auto"/>
+        <w:ind w:left="432"/>
         <w:jc w:val="both"/>
       </w:pPr>
       <w:r>
         <w:rPr>
           <w:rFonts w:ascii="Times New Roman" w:hAnsi="Times New Roman"/>
-          <w:color w:val="7C3AED"/>
+          <w:b/>
+          <w:color w:val="000000"/>
           <w:sz w:val="26"/>
         </w:rPr>
         <w:t xml:space="preserve">•  </w:t>
@@ -4151,7 +4222,7 @@
         <w:rPr>
           <w:rFonts w:ascii="Times New Roman" w:hAnsi="Times New Roman"/>
           <w:b/>
-          <w:color w:val="0F172A"/>
+          <w:color w:val="000000"/>
           <w:sz w:val="26"/>
         </w:rPr>
         <w:t xml:space="preserve">Bộ Kỹ năng Nguồn lực (Active Skills): </w:t>
@@ -4159,7 +4230,7 @@
       <w:r>
         <w:rPr>
           <w:rFonts w:ascii="Times New Roman" w:hAnsi="Times New Roman"/>
-          <w:color w:val="1E293B"/>
+          <w:color w:val="000000"/>
           <w:sz w:val="26"/>
         </w:rPr>
         <w:t>Kích hoạt Cơn Cuồng Phong (x2 DPC trong 10s) và Bão Vàng (Thưởng vàng lập tức).</w:t>
@@ -4175,8 +4246,8 @@
         <w:rPr>
           <w:rFonts w:ascii="Times New Roman" w:hAnsi="Times New Roman"/>
           <w:b/>
-          <w:color w:val="0F172A"/>
-          <w:sz w:val="28"/>
+          <w:color w:val="000000"/>
+          <w:sz w:val="27"/>
         </w:rPr>
         <w:t>2.2. Phân hệ Chế độ Chơi Đấu trường Trực tuyến (Competitive Real-time 1v1v1)</w:t>
       </w:r>
@@ -4184,14 +4255,15 @@
     <w:p>
       <w:pPr>
         <w:pStyle w:val="ListParagraph"/>
-        <w:spacing w:before="40" w:after="80" w:line="283" w:lineRule="auto"/>
-        <w:ind w:left="360"/>
+        <w:spacing w:before="40" w:after="80" w:line="288" w:lineRule="auto"/>
+        <w:ind w:left="432"/>
         <w:jc w:val="both"/>
       </w:pPr>
       <w:r>
         <w:rPr>
           <w:rFonts w:ascii="Times New Roman" w:hAnsi="Times New Roman"/>
-          <w:color w:val="7C3AED"/>
+          <w:b/>
+          <w:color w:val="000000"/>
           <w:sz w:val="26"/>
         </w:rPr>
         <w:t xml:space="preserve">•  </w:t>
@@ -4200,7 +4272,7 @@
         <w:rPr>
           <w:rFonts w:ascii="Times New Roman" w:hAnsi="Times New Roman"/>
           <w:b/>
-          <w:color w:val="0F172A"/>
+          <w:color w:val="000000"/>
           <w:sz w:val="26"/>
         </w:rPr>
         <w:t xml:space="preserve">Tạo và Gia nhập Phòng (Room Management): </w:t>
@@ -4208,7 +4280,7 @@
       <w:r>
         <w:rPr>
           <w:rFonts w:ascii="Times New Roman" w:hAnsi="Times New Roman"/>
-          <w:color w:val="1E293B"/>
+          <w:color w:val="000000"/>
           <w:sz w:val="26"/>
         </w:rPr>
         <w:t>Hệ thống phát sinh mã phòng ngẫu nhiên 6 ký tự để người chơi tạo phòng hoặc tham gia phòng đấu.</w:t>
@@ -4217,14 +4289,15 @@
     <w:p>
       <w:pPr>
         <w:pStyle w:val="ListParagraph"/>
-        <w:spacing w:before="40" w:after="80" w:line="283" w:lineRule="auto"/>
-        <w:ind w:left="360"/>
+        <w:spacing w:before="40" w:after="80" w:line="288" w:lineRule="auto"/>
+        <w:ind w:left="432"/>
         <w:jc w:val="both"/>
       </w:pPr>
       <w:r>
         <w:rPr>
           <w:rFonts w:ascii="Times New Roman" w:hAnsi="Times New Roman"/>
-          <w:color w:val="7C3AED"/>
+          <w:b/>
+          <w:color w:val="000000"/>
           <w:sz w:val="26"/>
         </w:rPr>
         <w:t xml:space="preserve">•  </w:t>
@@ -4233,7 +4306,7 @@
         <w:rPr>
           <w:rFonts w:ascii="Times New Roman" w:hAnsi="Times New Roman"/>
           <w:b/>
-          <w:color w:val="0F172A"/>
+          <w:color w:val="000000"/>
           <w:sz w:val="26"/>
         </w:rPr>
         <w:t xml:space="preserve">Tích hợp AI Bot tự động: </w:t>
@@ -4241,7 +4314,7 @@
       <w:r>
         <w:rPr>
           <w:rFonts w:ascii="Times New Roman" w:hAnsi="Times New Roman"/>
-          <w:color w:val="1E293B"/>
+          <w:color w:val="000000"/>
           <w:sz w:val="26"/>
         </w:rPr>
         <w:t>Cho phép chủ phòng thêm các đối thủ máy (AI Bots) với tần số nhấp chuột tự động ngẫu nhiên khi thiếu người.</w:t>
@@ -4250,14 +4323,15 @@
     <w:p>
       <w:pPr>
         <w:pStyle w:val="ListParagraph"/>
-        <w:spacing w:before="40" w:after="80" w:line="283" w:lineRule="auto"/>
-        <w:ind w:left="360"/>
+        <w:spacing w:before="40" w:after="80" w:line="288" w:lineRule="auto"/>
+        <w:ind w:left="432"/>
         <w:jc w:val="both"/>
       </w:pPr>
       <w:r>
         <w:rPr>
           <w:rFonts w:ascii="Times New Roman" w:hAnsi="Times New Roman"/>
-          <w:color w:val="7C3AED"/>
+          <w:b/>
+          <w:color w:val="000000"/>
           <w:sz w:val="26"/>
         </w:rPr>
         <w:t xml:space="preserve">•  </w:t>
@@ -4266,7 +4340,7 @@
         <w:rPr>
           <w:rFonts w:ascii="Times New Roman" w:hAnsi="Times New Roman"/>
           <w:b/>
-          <w:color w:val="0F172A"/>
+          <w:color w:val="000000"/>
           <w:sz w:val="26"/>
         </w:rPr>
         <w:t xml:space="preserve">Đấu trường 30 giây Real-time: </w:t>
@@ -4274,7 +4348,7 @@
       <w:r>
         <w:rPr>
           <w:rFonts w:ascii="Times New Roman" w:hAnsi="Times New Roman"/>
-          <w:color w:val="1E293B"/>
+          <w:color w:val="000000"/>
           <w:sz w:val="26"/>
         </w:rPr>
         <w:t>Đếm ngược 30 giây thi đấu nghẹt thở. Điểm số và nhịp click được đồng bộ thời gian thực qua WebSocket.</w:t>
@@ -4283,14 +4357,15 @@
     <w:p>
       <w:pPr>
         <w:pStyle w:val="ListParagraph"/>
-        <w:spacing w:before="40" w:after="80" w:line="283" w:lineRule="auto"/>
-        <w:ind w:left="360"/>
+        <w:spacing w:before="40" w:after="80" w:line="288" w:lineRule="auto"/>
+        <w:ind w:left="432"/>
         <w:jc w:val="both"/>
       </w:pPr>
       <w:r>
         <w:rPr>
           <w:rFonts w:ascii="Times New Roman" w:hAnsi="Times New Roman"/>
-          <w:color w:val="7C3AED"/>
+          <w:b/>
+          <w:color w:val="000000"/>
           <w:sz w:val="26"/>
         </w:rPr>
         <w:t xml:space="preserve">•  </w:t>
@@ -4299,7 +4374,7 @@
         <w:rPr>
           <w:rFonts w:ascii="Times New Roman" w:hAnsi="Times New Roman"/>
           <w:b/>
-          <w:color w:val="0F172A"/>
+          <w:color w:val="000000"/>
           <w:sz w:val="26"/>
         </w:rPr>
         <w:t xml:space="preserve">Bảng xếp hạng Trận đấu: </w:t>
@@ -4307,7 +4382,7 @@
       <w:r>
         <w:rPr>
           <w:rFonts w:ascii="Times New Roman" w:hAnsi="Times New Roman"/>
-          <w:color w:val="1E293B"/>
+          <w:color w:val="000000"/>
           <w:sz w:val="26"/>
         </w:rPr>
         <w:t>Kết xuất bảng vàng vinh danh thứ hạng #1, #2, #3 ngay sau khi kết thúc trận đấu.</w:t>
@@ -4323,8 +4398,8 @@
         <w:rPr>
           <w:rFonts w:ascii="Times New Roman" w:hAnsi="Times New Roman"/>
           <w:b/>
-          <w:color w:val="0F172A"/>
-          <w:sz w:val="28"/>
+          <w:color w:val="000000"/>
+          <w:sz w:val="27"/>
         </w:rPr>
         <w:t>2.3. Phân hệ Chế độ Chơi Hợp tác Trực tuyến (Co-op 3 Players)</w:t>
       </w:r>
@@ -4332,14 +4407,15 @@
     <w:p>
       <w:pPr>
         <w:pStyle w:val="ListParagraph"/>
-        <w:spacing w:before="40" w:after="80" w:line="283" w:lineRule="auto"/>
-        <w:ind w:left="360"/>
+        <w:spacing w:before="40" w:after="80" w:line="288" w:lineRule="auto"/>
+        <w:ind w:left="432"/>
         <w:jc w:val="both"/>
       </w:pPr>
       <w:r>
         <w:rPr>
           <w:rFonts w:ascii="Times New Roman" w:hAnsi="Times New Roman"/>
-          <w:color w:val="7C3AED"/>
+          <w:b/>
+          <w:color w:val="000000"/>
           <w:sz w:val="26"/>
         </w:rPr>
         <w:t xml:space="preserve">•  </w:t>
@@ -4348,7 +4424,7 @@
         <w:rPr>
           <w:rFonts w:ascii="Times New Roman" w:hAnsi="Times New Roman"/>
           <w:b/>
-          <w:color w:val="0F172A"/>
+          <w:color w:val="000000"/>
           <w:sz w:val="26"/>
         </w:rPr>
         <w:t xml:space="preserve">Đồng lòng hạ gục Mục tiêu: </w:t>
@@ -4356,7 +4432,7 @@
       <w:r>
         <w:rPr>
           <w:rFonts w:ascii="Times New Roman" w:hAnsi="Times New Roman"/>
-          <w:color w:val="1E293B"/>
+          <w:color w:val="000000"/>
           <w:sz w:val="26"/>
         </w:rPr>
         <w:t>3 người chơi chung tay nhấp chuột hạ gục Mục tiêu Boss/Cổ thụ/Quặng đá.</w:t>
@@ -4365,14 +4441,15 @@
     <w:p>
       <w:pPr>
         <w:pStyle w:val="ListParagraph"/>
-        <w:spacing w:before="40" w:after="80" w:line="283" w:lineRule="auto"/>
-        <w:ind w:left="360"/>
+        <w:spacing w:before="40" w:after="80" w:line="288" w:lineRule="auto"/>
+        <w:ind w:left="432"/>
         <w:jc w:val="both"/>
       </w:pPr>
       <w:r>
         <w:rPr>
           <w:rFonts w:ascii="Times New Roman" w:hAnsi="Times New Roman"/>
-          <w:color w:val="7C3AED"/>
+          <w:b/>
+          <w:color w:val="000000"/>
           <w:sz w:val="26"/>
         </w:rPr>
         <w:t xml:space="preserve">•  </w:t>
@@ -4381,7 +4458,7 @@
         <w:rPr>
           <w:rFonts w:ascii="Times New Roman" w:hAnsi="Times New Roman"/>
           <w:b/>
-          <w:color w:val="0F172A"/>
+          <w:color w:val="000000"/>
           <w:sz w:val="26"/>
         </w:rPr>
         <w:t xml:space="preserve">Rơi tài nguyên ngẫu nhiên (Resource Drops): </w:t>
@@ -4389,7 +4466,7 @@
       <w:r>
         <w:rPr>
           <w:rFonts w:ascii="Times New Roman" w:hAnsi="Times New Roman"/>
-          <w:color w:val="1E293B"/>
+          <w:color w:val="000000"/>
           <w:sz w:val="26"/>
         </w:rPr>
         <w:t>Các vật phẩm Thịt 🥩, Gỗ 🪵, Đá 🪨 rơi ra ngẫu nhiên khi nhấp chuột được đồng bộ lập tức cho mọi người trong phòng.</w:t>
@@ -4398,14 +4475,15 @@
     <w:p>
       <w:pPr>
         <w:pStyle w:val="ListParagraph"/>
-        <w:spacing w:before="40" w:after="80" w:line="283" w:lineRule="auto"/>
-        <w:ind w:left="360"/>
+        <w:spacing w:before="40" w:after="80" w:line="288" w:lineRule="auto"/>
+        <w:ind w:left="432"/>
         <w:jc w:val="both"/>
       </w:pPr>
       <w:r>
         <w:rPr>
           <w:rFonts w:ascii="Times New Roman" w:hAnsi="Times New Roman"/>
-          <w:color w:val="7C3AED"/>
+          <w:b/>
+          <w:color w:val="000000"/>
           <w:sz w:val="26"/>
         </w:rPr>
         <w:t xml:space="preserve">•  </w:t>
@@ -4414,7 +4492,7 @@
         <w:rPr>
           <w:rFonts w:ascii="Times New Roman" w:hAnsi="Times New Roman"/>
           <w:b/>
-          <w:color w:val="0F172A"/>
+          <w:color w:val="000000"/>
           <w:sz w:val="26"/>
         </w:rPr>
         <w:t xml:space="preserve">Nâng cấp dùng chung (Shared Upgrades): </w:t>
@@ -4422,7 +4500,7 @@
       <w:r>
         <w:rPr>
           <w:rFonts w:ascii="Times New Roman" w:hAnsi="Times New Roman"/>
-          <w:color w:val="1E293B"/>
+          <w:color w:val="000000"/>
           <w:sz w:val="26"/>
         </w:rPr>
         <w:t>Người chơi đóng góp tài nguyên thu gom được để mua Nâng cấp Sát thương chung, Hệ số nhân và Robot Auto-Click cho toàn phòng.</w:t>
@@ -4438,8 +4516,8 @@
         <w:rPr>
           <w:rFonts w:ascii="Times New Roman" w:hAnsi="Times New Roman"/>
           <w:b/>
-          <w:color w:val="0F172A"/>
-          <w:sz w:val="28"/>
+          <w:color w:val="000000"/>
+          <w:sz w:val="27"/>
         </w:rPr>
         <w:t>2.4. Phân hệ Đồ họa 3D Cartoon Theme &amp; Web Audio Synthesizer</w:t>
       </w:r>
@@ -4447,14 +4525,15 @@
     <w:p>
       <w:pPr>
         <w:pStyle w:val="ListParagraph"/>
-        <w:spacing w:before="40" w:after="80" w:line="283" w:lineRule="auto"/>
-        <w:ind w:left="360"/>
+        <w:spacing w:before="40" w:after="80" w:line="288" w:lineRule="auto"/>
+        <w:ind w:left="432"/>
         <w:jc w:val="both"/>
       </w:pPr>
       <w:r>
         <w:rPr>
           <w:rFonts w:ascii="Times New Roman" w:hAnsi="Times New Roman"/>
-          <w:color w:val="7C3AED"/>
+          <w:b/>
+          <w:color w:val="000000"/>
           <w:sz w:val="26"/>
         </w:rPr>
         <w:t xml:space="preserve">•  </w:t>
@@ -4463,7 +4542,7 @@
         <w:rPr>
           <w:rFonts w:ascii="Times New Roman" w:hAnsi="Times New Roman"/>
           <w:b/>
-          <w:color w:val="0F172A"/>
+          <w:color w:val="000000"/>
           <w:sz w:val="26"/>
         </w:rPr>
         <w:t xml:space="preserve">3 Đồ họa Theme 3D Hoạt hình: </w:t>
@@ -4471,7 +4550,7 @@
       <w:r>
         <w:rPr>
           <w:rFonts w:ascii="Times New Roman" w:hAnsi="Times New Roman"/>
-          <w:color w:val="1E293B"/>
+          <w:color w:val="000000"/>
           <w:sz w:val="26"/>
         </w:rPr>
         <w:t>Đánh Quái Vật (Monster Fight), Tiều Phu Chặt Gỗ (Woodcutter), Thợ Mỏ Đào Đá (Stone Mining).</w:t>
@@ -4480,14 +4559,15 @@
     <w:p>
       <w:pPr>
         <w:pStyle w:val="ListParagraph"/>
-        <w:spacing w:before="40" w:after="80" w:line="283" w:lineRule="auto"/>
-        <w:ind w:left="360"/>
+        <w:spacing w:before="40" w:after="80" w:line="288" w:lineRule="auto"/>
+        <w:ind w:left="432"/>
         <w:jc w:val="both"/>
       </w:pPr>
       <w:r>
         <w:rPr>
           <w:rFonts w:ascii="Times New Roman" w:hAnsi="Times New Roman"/>
-          <w:color w:val="7C3AED"/>
+          <w:b/>
+          <w:color w:val="000000"/>
           <w:sz w:val="26"/>
         </w:rPr>
         <w:t xml:space="preserve">•  </w:t>
@@ -4496,7 +4576,7 @@
         <w:rPr>
           <w:rFonts w:ascii="Times New Roman" w:hAnsi="Times New Roman"/>
           <w:b/>
-          <w:color w:val="0F172A"/>
+          <w:color w:val="000000"/>
           <w:sz w:val="26"/>
         </w:rPr>
         <w:t xml:space="preserve">Bộ âm thanh Web Audio API: </w:t>
@@ -4504,7 +4584,7 @@
       <w:r>
         <w:rPr>
           <w:rFonts w:ascii="Times New Roman" w:hAnsi="Times New Roman"/>
-          <w:color w:val="1E293B"/>
+          <w:color w:val="000000"/>
           <w:sz w:val="26"/>
         </w:rPr>
         <w:t>Tự động tạo các dải sóng âm thanh (Click, Buy, Skill, Rebirth) trực tiếp qua Web Audio API.</w:t>
@@ -4520,8 +4600,8 @@
         <w:rPr>
           <w:rFonts w:ascii="Times New Roman" w:hAnsi="Times New Roman"/>
           <w:b/>
-          <w:color w:val="0F172A"/>
-          <w:sz w:val="28"/>
+          <w:color w:val="000000"/>
+          <w:sz w:val="27"/>
         </w:rPr>
         <w:t>2.5. Phân hệ Quản lý Cơ sở Dữ liệu MySQL &amp; Server Cloud</w:t>
       </w:r>
@@ -4529,14 +4609,15 @@
     <w:p>
       <w:pPr>
         <w:pStyle w:val="ListParagraph"/>
-        <w:spacing w:before="40" w:after="80" w:line="283" w:lineRule="auto"/>
-        <w:ind w:left="360"/>
+        <w:spacing w:before="40" w:after="80" w:line="288" w:lineRule="auto"/>
+        <w:ind w:left="432"/>
         <w:jc w:val="both"/>
       </w:pPr>
       <w:r>
         <w:rPr>
           <w:rFonts w:ascii="Times New Roman" w:hAnsi="Times New Roman"/>
-          <w:color w:val="7C3AED"/>
+          <w:b/>
+          <w:color w:val="000000"/>
           <w:sz w:val="26"/>
         </w:rPr>
         <w:t xml:space="preserve">•  </w:t>
@@ -4545,7 +4626,7 @@
         <w:rPr>
           <w:rFonts w:ascii="Times New Roman" w:hAnsi="Times New Roman"/>
           <w:b/>
-          <w:color w:val="0F172A"/>
+          <w:color w:val="000000"/>
           <w:sz w:val="26"/>
         </w:rPr>
         <w:t xml:space="preserve">Cơ sở dữ liệu MySQL: </w:t>
@@ -4553,7 +4634,7 @@
       <w:r>
         <w:rPr>
           <w:rFonts w:ascii="Times New Roman" w:hAnsi="Times New Roman"/>
-          <w:color w:val="1E293B"/>
+          <w:color w:val="000000"/>
           <w:sz w:val="26"/>
         </w:rPr>
         <w:t>Lưu giữ kết quả các phòng đấu, điểm số người chơi và lịch sử trận đấu.</w:t>
@@ -4562,14 +4643,15 @@
     <w:p>
       <w:pPr>
         <w:pStyle w:val="ListParagraph"/>
-        <w:spacing w:before="40" w:after="80" w:line="283" w:lineRule="auto"/>
-        <w:ind w:left="360"/>
+        <w:spacing w:before="40" w:after="80" w:line="288" w:lineRule="auto"/>
+        <w:ind w:left="432"/>
         <w:jc w:val="both"/>
       </w:pPr>
       <w:r>
         <w:rPr>
           <w:rFonts w:ascii="Times New Roman" w:hAnsi="Times New Roman"/>
-          <w:color w:val="7C3AED"/>
+          <w:b/>
+          <w:color w:val="000000"/>
           <w:sz w:val="26"/>
         </w:rPr>
         <w:t xml:space="preserve">•  </w:t>
@@ -4578,7 +4660,7 @@
         <w:rPr>
           <w:rFonts w:ascii="Times New Roman" w:hAnsi="Times New Roman"/>
           <w:b/>
-          <w:color w:val="0F172A"/>
+          <w:color w:val="000000"/>
           <w:sz w:val="26"/>
         </w:rPr>
         <w:t xml:space="preserve">Triển khai Cloud Server Railway: </w:t>
@@ -4586,7 +4668,7 @@
       <w:r>
         <w:rPr>
           <w:rFonts w:ascii="Times New Roman" w:hAnsi="Times New Roman"/>
-          <w:color w:val="1E293B"/>
+          <w:color w:val="000000"/>
           <w:sz w:val="26"/>
         </w:rPr>
         <w:t>Triển khai trên máy chủ Railway Cloud với listener binding `0.0.0.0:${PORT}` bảo đảm kết nối mượt mà 24/7.</w:t>
@@ -4602,8 +4684,8 @@
         <w:rPr>
           <w:rFonts w:ascii="Times New Roman" w:hAnsi="Times New Roman"/>
           <w:b/>
-          <w:color w:val="7C3AED"/>
-          <w:sz w:val="32"/>
+          <w:color w:val="000000"/>
+          <w:sz w:val="30"/>
         </w:rPr>
         <w:t>CHƯƠNG 3: ĐẶC TẢ SƠ ĐỒ LUỒNG XỬ LÝ (WORKFLOWS)</w:t>
       </w:r>
@@ -4618,16 +4700,16 @@
         <w:rPr>
           <w:rFonts w:ascii="Times New Roman" w:hAnsi="Times New Roman"/>
           <w:b/>
-          <w:color w:val="0F172A"/>
-          <w:sz w:val="28"/>
+          <w:color w:val="000000"/>
+          <w:sz w:val="27"/>
         </w:rPr>
         <w:t>3.1. Sơ đồ Luồng xử lý Chơi đơn Offline</w:t>
       </w:r>
     </w:p>
     <w:p>
       <w:pPr>
-        <w:spacing w:before="40" w:after="100" w:line="288" w:lineRule="auto"/>
-        <w:ind w:firstLine="432"/>
+        <w:spacing w:before="40" w:after="80" w:line="288" w:lineRule="auto"/>
+        <w:ind w:firstLine="720"/>
         <w:jc w:val="both"/>
       </w:pPr>
       <w:r>
@@ -4635,7 +4717,7 @@
           <w:rFonts w:ascii="Times New Roman" w:hAnsi="Times New Roman"/>
           <w:b w:val="0"/>
           <w:i w:val="0"/>
-          <w:color w:val="1E293B"/>
+          <w:color w:val="000000"/>
           <w:sz w:val="26"/>
         </w:rPr>
         <w:t>Người chơi mở Game → Chọn Chế độ Ngoại tuyến → Chọn Mô hình Đồ họa Theme → Nhấp chuột tích điểm → Thuê công cụ nâng cấp DPC/DPS → Tích lũy sạc Nộ x2 → Kích hoạt Kỹ năng / Trùng sinh → Dữ liệu tự động lưu vào LocalStorage.</w:t>
@@ -4651,16 +4733,16 @@
         <w:rPr>
           <w:rFonts w:ascii="Times New Roman" w:hAnsi="Times New Roman"/>
           <w:b/>
-          <w:color w:val="0F172A"/>
-          <w:sz w:val="28"/>
+          <w:color w:val="000000"/>
+          <w:sz w:val="27"/>
         </w:rPr>
         <w:t>3.2. Sơ đồ Luồng xử lý Đấu trường Trực tuyến</w:t>
       </w:r>
     </w:p>
     <w:p>
       <w:pPr>
-        <w:spacing w:before="40" w:after="100" w:line="288" w:lineRule="auto"/>
-        <w:ind w:firstLine="432"/>
+        <w:spacing w:before="40" w:after="80" w:line="288" w:lineRule="auto"/>
+        <w:ind w:firstLine="720"/>
         <w:jc w:val="both"/>
       </w:pPr>
       <w:r>
@@ -4668,7 +4750,7 @@
           <w:rFonts w:ascii="Times New Roman" w:hAnsi="Times New Roman"/>
           <w:b w:val="0"/>
           <w:i w:val="0"/>
-          <w:color w:val="1E293B"/>
+          <w:color w:val="000000"/>
           <w:sz w:val="26"/>
         </w:rPr>
         <w:t>Người chơi kết nối Máy chủ → Chọn Tạo phòng Đấu trường (hoặc Nhập mã 6 số) → Thêm AI Bot nếu thiếu người → Bấm Sẵn sàng (Ready) → Đếm ngược 30s thi đấu Click realtime → Server tổng kết Bảng xếp hạng trao thưởng.</w:t>
@@ -4684,16 +4766,16 @@
         <w:rPr>
           <w:rFonts w:ascii="Times New Roman" w:hAnsi="Times New Roman"/>
           <w:b/>
-          <w:color w:val="0F172A"/>
-          <w:sz w:val="28"/>
+          <w:color w:val="000000"/>
+          <w:sz w:val="27"/>
         </w:rPr>
         <w:t>3.3. Sơ đồ Luồng xử lý Hợp tác Trực tuyến</w:t>
       </w:r>
     </w:p>
     <w:p>
       <w:pPr>
-        <w:spacing w:before="40" w:after="100" w:line="288" w:lineRule="auto"/>
-        <w:ind w:firstLine="432"/>
+        <w:spacing w:before="40" w:after="80" w:line="288" w:lineRule="auto"/>
+        <w:ind w:firstLine="720"/>
         <w:jc w:val="both"/>
       </w:pPr>
       <w:r>
@@ -4701,7 +4783,7 @@
           <w:rFonts w:ascii="Times New Roman" w:hAnsi="Times New Roman"/>
           <w:b w:val="0"/>
           <w:i w:val="0"/>
-          <w:color w:val="1E293B"/>
+          <w:color w:val="000000"/>
           <w:sz w:val="26"/>
         </w:rPr>
         <w:t>Người chơi vào Phòng Hợp tác → Cùng các thành viên nhấp chuột thu gom nguyên liệu Thịt/Gỗ/Đá → Đóng góp nguyên liệu mua Nâng cấp chung → Đánh gục Boss/Cổ thụ/Vỉa đá → Hệ thống lưu vết nhật ký đồng bộ.</w:t>
@@ -4717,8 +4799,8 @@
         <w:rPr>
           <w:rFonts w:ascii="Times New Roman" w:hAnsi="Times New Roman"/>
           <w:b/>
-          <w:color w:val="7C3AED"/>
-          <w:sz w:val="32"/>
+          <w:color w:val="000000"/>
+          <w:sz w:val="30"/>
         </w:rPr>
         <w:t>CHƯƠNG 4: THIẾT KẾ CƠ SỞ DỮ LIỆU VÀ MÁY CHỦ MULTIPLAYER</w:t>
       </w:r>
@@ -4733,16 +4815,16 @@
         <w:rPr>
           <w:rFonts w:ascii="Times New Roman" w:hAnsi="Times New Roman"/>
           <w:b/>
-          <w:color w:val="0F172A"/>
-          <w:sz w:val="28"/>
+          <w:color w:val="000000"/>
+          <w:sz w:val="27"/>
         </w:rPr>
         <w:t>4.1. Cấu trúc Thực thể Cơ sở Dữ liệu (Database Schema)</w:t>
       </w:r>
     </w:p>
     <w:p>
       <w:pPr>
-        <w:spacing w:before="40" w:after="100" w:line="288" w:lineRule="auto"/>
-        <w:ind w:firstLine="432"/>
+        <w:spacing w:before="40" w:after="80" w:line="288" w:lineRule="auto"/>
+        <w:ind w:firstLine="720"/>
         <w:jc w:val="both"/>
       </w:pPr>
       <w:r>
@@ -4750,7 +4832,7 @@
           <w:rFonts w:ascii="Times New Roman" w:hAnsi="Times New Roman"/>
           <w:b w:val="0"/>
           <w:i w:val="0"/>
-          <w:color w:val="1E293B"/>
+          <w:color w:val="000000"/>
           <w:sz w:val="26"/>
         </w:rPr>
         <w:t>Cơ sở dữ liệu MySQL của hệ thống được thiết kế tối ưu với các bảng lưu trữ thông tin phòng chơi, tài khoản và lịch sử trận đấu như sau:</w:t>
@@ -4772,7 +4854,7 @@
         <w:tc>
           <w:tcPr>
             <w:tcW w:type="dxa" w:w="2267"/>
-            <w:shd w:fill="7C3AED"/>
+            <w:shd w:fill="1E293B"/>
           </w:tcPr>
           <w:p>
             <w:pPr>
@@ -4780,6 +4862,7 @@
             </w:pPr>
             <w:r>
               <w:rPr>
+                <w:rFonts w:ascii="Times New Roman" w:hAnsi="Times New Roman"/>
                 <w:b/>
                 <w:color w:val="FFFFFF"/>
               </w:rPr>
@@ -4790,7 +4873,7 @@
         <w:tc>
           <w:tcPr>
             <w:tcW w:type="dxa" w:w="2267"/>
-            <w:shd w:fill="7C3AED"/>
+            <w:shd w:fill="1E293B"/>
           </w:tcPr>
           <w:p>
             <w:pPr>
@@ -4798,6 +4881,7 @@
             </w:pPr>
             <w:r>
               <w:rPr>
+                <w:rFonts w:ascii="Times New Roman" w:hAnsi="Times New Roman"/>
                 <w:b/>
                 <w:color w:val="FFFFFF"/>
               </w:rPr>
@@ -4808,7 +4892,7 @@
         <w:tc>
           <w:tcPr>
             <w:tcW w:type="dxa" w:w="2267"/>
-            <w:shd w:fill="7C3AED"/>
+            <w:shd w:fill="1E293B"/>
           </w:tcPr>
           <w:p>
             <w:pPr>
@@ -4816,6 +4900,7 @@
             </w:pPr>
             <w:r>
               <w:rPr>
+                <w:rFonts w:ascii="Times New Roman" w:hAnsi="Times New Roman"/>
                 <w:b/>
                 <w:color w:val="FFFFFF"/>
               </w:rPr>
@@ -4826,7 +4911,7 @@
         <w:tc>
           <w:tcPr>
             <w:tcW w:type="dxa" w:w="2267"/>
-            <w:shd w:fill="7C3AED"/>
+            <w:shd w:fill="1E293B"/>
           </w:tcPr>
           <w:p>
             <w:pPr>
@@ -4834,6 +4919,7 @@
             </w:pPr>
             <w:r>
               <w:rPr>
+                <w:rFonts w:ascii="Times New Roman" w:hAnsi="Times New Roman"/>
                 <w:b/>
                 <w:color w:val="FFFFFF"/>
               </w:rPr>
@@ -4855,6 +4941,7 @@
             <w:r>
               <w:rPr>
                 <w:rFonts w:ascii="Times New Roman" w:hAnsi="Times New Roman"/>
+                <w:color w:val="000000"/>
                 <w:sz w:val="22"/>
               </w:rPr>
               <w:t>players</w:t>
@@ -4873,6 +4960,7 @@
             <w:r>
               <w:rPr>
                 <w:rFonts w:ascii="Times New Roman" w:hAnsi="Times New Roman"/>
+                <w:color w:val="000000"/>
                 <w:sz w:val="22"/>
               </w:rPr>
               <w:t>id (VARCHAR)</w:t>
@@ -4891,6 +4979,7 @@
             <w:r>
               <w:rPr>
                 <w:rFonts w:ascii="Times New Roman" w:hAnsi="Times New Roman"/>
+                <w:color w:val="000000"/>
                 <w:sz w:val="22"/>
               </w:rPr>
               <w:t>room_code</w:t>
@@ -4909,6 +4998,7 @@
             <w:r>
               <w:rPr>
                 <w:rFonts w:ascii="Times New Roman" w:hAnsi="Times New Roman"/>
+                <w:color w:val="000000"/>
                 <w:sz w:val="22"/>
               </w:rPr>
               <w:t>Quản lý thông tin người chơi, biệt danh, chỉ số DPC, DPS, điểm số.</w:t>
@@ -4929,6 +5019,7 @@
             <w:r>
               <w:rPr>
                 <w:rFonts w:ascii="Times New Roman" w:hAnsi="Times New Roman"/>
+                <w:color w:val="000000"/>
                 <w:sz w:val="22"/>
               </w:rPr>
               <w:t>rooms</w:t>
@@ -4947,6 +5038,7 @@
             <w:r>
               <w:rPr>
                 <w:rFonts w:ascii="Times New Roman" w:hAnsi="Times New Roman"/>
+                <w:color w:val="000000"/>
                 <w:sz w:val="22"/>
               </w:rPr>
               <w:t>code (VARCHAR)</w:t>
@@ -4965,6 +5057,7 @@
             <w:r>
               <w:rPr>
                 <w:rFonts w:ascii="Times New Roman" w:hAnsi="Times New Roman"/>
+                <w:color w:val="000000"/>
                 <w:sz w:val="22"/>
               </w:rPr>
               <w:t>-</w:t>
@@ -4983,6 +5076,7 @@
             <w:r>
               <w:rPr>
                 <w:rFonts w:ascii="Times New Roman" w:hAnsi="Times New Roman"/>
+                <w:color w:val="000000"/>
                 <w:sz w:val="22"/>
               </w:rPr>
               <w:t>Quản lý thông tin phòng chơi online, trạng thái (lobby/playing/finished), timer.</w:t>
@@ -5003,6 +5097,7 @@
             <w:r>
               <w:rPr>
                 <w:rFonts w:ascii="Times New Roman" w:hAnsi="Times New Roman"/>
+                <w:color w:val="000000"/>
                 <w:sz w:val="22"/>
               </w:rPr>
               <w:t>game_sessions</w:t>
@@ -5021,6 +5116,7 @@
             <w:r>
               <w:rPr>
                 <w:rFonts w:ascii="Times New Roman" w:hAnsi="Times New Roman"/>
+                <w:color w:val="000000"/>
                 <w:sz w:val="22"/>
               </w:rPr>
               <w:t>id (INT AUTO)</w:t>
@@ -5039,6 +5135,7 @@
             <w:r>
               <w:rPr>
                 <w:rFonts w:ascii="Times New Roman" w:hAnsi="Times New Roman"/>
+                <w:color w:val="000000"/>
                 <w:sz w:val="22"/>
               </w:rPr>
               <w:t>room_code</w:t>
@@ -5057,6 +5154,7 @@
             <w:r>
               <w:rPr>
                 <w:rFonts w:ascii="Times New Roman" w:hAnsi="Times New Roman"/>
+                <w:color w:val="000000"/>
                 <w:sz w:val="22"/>
               </w:rPr>
               <w:t>Lưu vết lịch sử các trận đấu đã hoàn thành và người chiến thắng.</w:t>
@@ -5077,6 +5175,7 @@
             <w:r>
               <w:rPr>
                 <w:rFonts w:ascii="Times New Roman" w:hAnsi="Times New Roman"/>
+                <w:color w:val="000000"/>
                 <w:sz w:val="22"/>
               </w:rPr>
               <w:t>coop_resources</w:t>
@@ -5095,6 +5194,7 @@
             <w:r>
               <w:rPr>
                 <w:rFonts w:ascii="Times New Roman" w:hAnsi="Times New Roman"/>
+                <w:color w:val="000000"/>
                 <w:sz w:val="22"/>
               </w:rPr>
               <w:t>id (INT AUTO)</w:t>
@@ -5113,6 +5213,7 @@
             <w:r>
               <w:rPr>
                 <w:rFonts w:ascii="Times New Roman" w:hAnsi="Times New Roman"/>
+                <w:color w:val="000000"/>
                 <w:sz w:val="22"/>
               </w:rPr>
               <w:t>room_code</w:t>
@@ -5131,6 +5232,7 @@
             <w:r>
               <w:rPr>
                 <w:rFonts w:ascii="Times New Roman" w:hAnsi="Times New Roman"/>
+                <w:color w:val="000000"/>
                 <w:sz w:val="22"/>
               </w:rPr>
               <w:t>Lưu giữ số lượng tài nguyên Thịt, Gỗ, Đá tích lũy trong chế độ Hợp tác.</w:t>
@@ -5151,6 +5253,7 @@
             <w:r>
               <w:rPr>
                 <w:rFonts w:ascii="Times New Roman" w:hAnsi="Times New Roman"/>
+                <w:color w:val="000000"/>
                 <w:sz w:val="22"/>
               </w:rPr>
               <w:t>coop_upgrades</w:t>
@@ -5169,6 +5272,7 @@
             <w:r>
               <w:rPr>
                 <w:rFonts w:ascii="Times New Roman" w:hAnsi="Times New Roman"/>
+                <w:color w:val="000000"/>
                 <w:sz w:val="22"/>
               </w:rPr>
               <w:t>id (INT AUTO)</w:t>
@@ -5187,6 +5291,7 @@
             <w:r>
               <w:rPr>
                 <w:rFonts w:ascii="Times New Roman" w:hAnsi="Times New Roman"/>
+                <w:color w:val="000000"/>
                 <w:sz w:val="22"/>
               </w:rPr>
               <w:t>room_code</w:t>
@@ -5205,6 +5310,7 @@
             <w:r>
               <w:rPr>
                 <w:rFonts w:ascii="Times New Roman" w:hAnsi="Times New Roman"/>
+                <w:color w:val="000000"/>
                 <w:sz w:val="22"/>
               </w:rPr>
               <w:t>Lưu giữ cấp độ các nâng cấp dùng chung của phòng Hợp tác.</w:t>
@@ -5215,8 +5321,8 @@
     </w:tbl>
     <w:p>
       <w:pPr>
-        <w:spacing w:before="40" w:after="100" w:line="288" w:lineRule="auto"/>
-        <w:ind w:firstLine="432"/>
+        <w:spacing w:before="40" w:after="80" w:line="288" w:lineRule="auto"/>
+        <w:ind w:firstLine="720"/>
         <w:jc w:val="both"/>
       </w:pPr>
     </w:p>
@@ -5230,8 +5336,8 @@
         <w:rPr>
           <w:rFonts w:ascii="Times New Roman" w:hAnsi="Times New Roman"/>
           <w:b/>
-          <w:color w:val="0F172A"/>
-          <w:sz w:val="28"/>
+          <w:color w:val="000000"/>
+          <w:sz w:val="27"/>
         </w:rPr>
         <w:t>4.2. Xử lý các Tình huống Vận hành Thực tế</w:t>
       </w:r>
@@ -5239,14 +5345,15 @@
     <w:p>
       <w:pPr>
         <w:pStyle w:val="ListParagraph"/>
-        <w:spacing w:before="40" w:after="80" w:line="283" w:lineRule="auto"/>
-        <w:ind w:left="360"/>
+        <w:spacing w:before="40" w:after="80" w:line="288" w:lineRule="auto"/>
+        <w:ind w:left="432"/>
         <w:jc w:val="both"/>
       </w:pPr>
       <w:r>
         <w:rPr>
           <w:rFonts w:ascii="Times New Roman" w:hAnsi="Times New Roman"/>
-          <w:color w:val="7C3AED"/>
+          <w:b/>
+          <w:color w:val="000000"/>
           <w:sz w:val="26"/>
         </w:rPr>
         <w:t xml:space="preserve">•  </w:t>
@@ -5255,7 +5362,7 @@
         <w:rPr>
           <w:rFonts w:ascii="Times New Roman" w:hAnsi="Times New Roman"/>
           <w:b/>
-          <w:color w:val="0F172A"/>
+          <w:color w:val="000000"/>
           <w:sz w:val="26"/>
         </w:rPr>
         <w:t xml:space="preserve">Tình huống 1: Mất kết nối mạng đột ngột (Network Disconnect Fallback): </w:t>
@@ -5263,7 +5370,7 @@
       <w:r>
         <w:rPr>
           <w:rFonts w:ascii="Times New Roman" w:hAnsi="Times New Roman"/>
-          <w:color w:val="1E293B"/>
+          <w:color w:val="000000"/>
           <w:sz w:val="26"/>
         </w:rPr>
         <w:t>Nếu thiết bị đột ngột mất kết nối Socket, game tự động chuyển về chế độ Offline mà không làm gián đoạn trải nghiệm người chơi.</w:t>
@@ -5272,14 +5379,15 @@
     <w:p>
       <w:pPr>
         <w:pStyle w:val="ListParagraph"/>
-        <w:spacing w:before="40" w:after="80" w:line="283" w:lineRule="auto"/>
-        <w:ind w:left="360"/>
+        <w:spacing w:before="40" w:after="80" w:line="288" w:lineRule="auto"/>
+        <w:ind w:left="432"/>
         <w:jc w:val="both"/>
       </w:pPr>
       <w:r>
         <w:rPr>
           <w:rFonts w:ascii="Times New Roman" w:hAnsi="Times New Roman"/>
-          <w:color w:val="7C3AED"/>
+          <w:b/>
+          <w:color w:val="000000"/>
           <w:sz w:val="26"/>
         </w:rPr>
         <w:t xml:space="preserve">•  </w:t>
@@ -5288,7 +5396,7 @@
         <w:rPr>
           <w:rFonts w:ascii="Times New Roman" w:hAnsi="Times New Roman"/>
           <w:b/>
-          <w:color w:val="0F172A"/>
+          <w:color w:val="000000"/>
           <w:sz w:val="26"/>
         </w:rPr>
         <w:t xml:space="preserve">Tình huống 2: Thiếu người chơi trong phòng Đấu trường (AI Bot Filling): </w:t>
@@ -5296,7 +5404,7 @@
       <w:r>
         <w:rPr>
           <w:rFonts w:ascii="Times New Roman" w:hAnsi="Times New Roman"/>
-          <w:color w:val="1E293B"/>
+          <w:color w:val="000000"/>
           <w:sz w:val="26"/>
         </w:rPr>
         <w:t>Chủ phòng có thể bấm Thêm Bot. Hệ thống tự động khởi tạo luồng AI Bot tự động nhấp chuột với tần số ngẫu nhiên 200-400ms.</w:t>
@@ -5305,14 +5413,15 @@
     <w:p>
       <w:pPr>
         <w:pStyle w:val="ListParagraph"/>
-        <w:spacing w:before="40" w:after="80" w:line="283" w:lineRule="auto"/>
-        <w:ind w:left="360"/>
+        <w:spacing w:before="40" w:after="80" w:line="288" w:lineRule="auto"/>
+        <w:ind w:left="432"/>
         <w:jc w:val="both"/>
       </w:pPr>
       <w:r>
         <w:rPr>
           <w:rFonts w:ascii="Times New Roman" w:hAnsi="Times New Roman"/>
-          <w:color w:val="7C3AED"/>
+          <w:b/>
+          <w:color w:val="000000"/>
           <w:sz w:val="26"/>
         </w:rPr>
         <w:t xml:space="preserve">•  </w:t>
@@ -5321,7 +5430,7 @@
         <w:rPr>
           <w:rFonts w:ascii="Times New Roman" w:hAnsi="Times New Roman"/>
           <w:b/>
-          <w:color w:val="0F172A"/>
+          <w:color w:val="000000"/>
           <w:sz w:val="26"/>
         </w:rPr>
         <w:t xml:space="preserve">Tình huống 3: Tương thích máy chủ Cloud Railway (Host Binding): </w:t>
@@ -5329,7 +5438,7 @@
       <w:r>
         <w:rPr>
           <w:rFonts w:ascii="Times New Roman" w:hAnsi="Times New Roman"/>
-          <w:color w:val="1E293B"/>
+          <w:color w:val="000000"/>
           <w:sz w:val="26"/>
         </w:rPr>
         <w:t>Khi deploy lên máy chủ Railway Cloud, server tự động ràng buộc địa chỉ `0.0.0.0:${PORT}` để tiếp nhận kết nối bên ngoài mượt mà.</w:t>
@@ -5345,8 +5454,8 @@
         <w:rPr>
           <w:rFonts w:ascii="Times New Roman" w:hAnsi="Times New Roman"/>
           <w:b/>
-          <w:color w:val="7C3AED"/>
-          <w:sz w:val="32"/>
+          <w:color w:val="000000"/>
+          <w:sz w:val="30"/>
         </w:rPr>
         <w:t>CHƯƠNG 5: THIẾT LẬP CÔNG NGHỆ VÀ TRIỂN KHAI CLOUD</w:t>
       </w:r>
@@ -5365,7 +5474,7 @@
         <w:tc>
           <w:tcPr>
             <w:tcW w:type="dxa" w:w="4535"/>
-            <w:shd w:fill="7C3AED"/>
+            <w:shd w:fill="1E293B"/>
           </w:tcPr>
           <w:p>
             <w:pPr>
@@ -5373,6 +5482,7 @@
             </w:pPr>
             <w:r>
               <w:rPr>
+                <w:rFonts w:ascii="Times New Roman" w:hAnsi="Times New Roman"/>
                 <w:b/>
                 <w:color w:val="FFFFFF"/>
               </w:rPr>
@@ -5383,7 +5493,7 @@
         <w:tc>
           <w:tcPr>
             <w:tcW w:type="dxa" w:w="4535"/>
-            <w:shd w:fill="7C3AED"/>
+            <w:shd w:fill="1E293B"/>
           </w:tcPr>
           <w:p>
             <w:pPr>
@@ -5391,6 +5501,7 @@
             </w:pPr>
             <w:r>
               <w:rPr>
+                <w:rFonts w:ascii="Times New Roman" w:hAnsi="Times New Roman"/>
                 <w:b/>
                 <w:color w:val="FFFFFF"/>
               </w:rPr>
@@ -5413,6 +5524,7 @@
               <w:rPr>
                 <w:rFonts w:ascii="Times New Roman" w:hAnsi="Times New Roman"/>
                 <w:b/>
+                <w:color w:val="000000"/>
                 <w:sz w:val="22"/>
               </w:rPr>
               <w:t>Frontend UI Engine</w:t>
@@ -5431,6 +5543,7 @@
             <w:r>
               <w:rPr>
                 <w:rFonts w:ascii="Times New Roman" w:hAnsi="Times New Roman"/>
+                <w:color w:val="000000"/>
                 <w:sz w:val="22"/>
               </w:rPr>
               <w:t>React 19, HTML5, Vanilla CSS3 (Glassmorphism &amp; Sunburst animations), Lucide Icons, Web Audio API</w:t>
@@ -5452,6 +5565,7 @@
               <w:rPr>
                 <w:rFonts w:ascii="Times New Roman" w:hAnsi="Times New Roman"/>
                 <w:b/>
+                <w:color w:val="000000"/>
                 <w:sz w:val="22"/>
               </w:rPr>
               <w:t>Backend Core Server</w:t>
@@ -5470,6 +5584,7 @@
             <w:r>
               <w:rPr>
                 <w:rFonts w:ascii="Times New Roman" w:hAnsi="Times New Roman"/>
+                <w:color w:val="000000"/>
                 <w:sz w:val="22"/>
               </w:rPr>
               <w:t>Node.js, Express.js (REST API &amp; Static Server)</w:t>
@@ -5491,6 +5606,7 @@
               <w:rPr>
                 <w:rFonts w:ascii="Times New Roman" w:hAnsi="Times New Roman"/>
                 <w:b/>
+                <w:color w:val="000000"/>
                 <w:sz w:val="22"/>
               </w:rPr>
               <w:t>Real-time Protocol</w:t>
@@ -5509,6 +5625,7 @@
             <w:r>
               <w:rPr>
                 <w:rFonts w:ascii="Times New Roman" w:hAnsi="Times New Roman"/>
+                <w:color w:val="000000"/>
                 <w:sz w:val="22"/>
               </w:rPr>
               <w:t>Socket.io v4 (Full-duplex WebSocket Real-time Communication)</w:t>
@@ -5530,6 +5647,7 @@
               <w:rPr>
                 <w:rFonts w:ascii="Times New Roman" w:hAnsi="Times New Roman"/>
                 <w:b/>
+                <w:color w:val="000000"/>
                 <w:sz w:val="22"/>
               </w:rPr>
               <w:t>Database &amp; Deployment</w:t>
@@ -5548,6 +5666,7 @@
             <w:r>
               <w:rPr>
                 <w:rFonts w:ascii="Times New Roman" w:hAnsi="Times New Roman"/>
+                <w:color w:val="000000"/>
                 <w:sz w:val="22"/>
               </w:rPr>
               <w:t>MySQL (mysql2 pool), Railway Cloud (Node Server), GitHub Pages (Static Host), GitHub Actions CI/CD</w:t>
@@ -5558,8 +5677,8 @@
     </w:tbl>
     <w:p>
       <w:pPr>
-        <w:spacing w:before="40" w:after="100" w:line="288" w:lineRule="auto"/>
-        <w:ind w:firstLine="432"/>
+        <w:spacing w:before="40" w:after="80" w:line="288" w:lineRule="auto"/>
+        <w:ind w:firstLine="720"/>
         <w:jc w:val="both"/>
       </w:pPr>
     </w:p>
@@ -5573,16 +5692,16 @@
         <w:rPr>
           <w:rFonts w:ascii="Times New Roman" w:hAnsi="Times New Roman"/>
           <w:b/>
-          <w:color w:val="7C3AED"/>
-          <w:sz w:val="32"/>
+          <w:color w:val="000000"/>
+          <w:sz w:val="30"/>
         </w:rPr>
         <w:t>KẾT LUẬN VÀ HƯỚNG PHÁT TRIỂN</w:t>
       </w:r>
     </w:p>
     <w:p>
       <w:pPr>
-        <w:spacing w:before="40" w:after="100" w:line="288" w:lineRule="auto"/>
-        <w:ind w:firstLine="432"/>
+        <w:spacing w:before="40" w:after="80" w:line="288" w:lineRule="auto"/>
+        <w:ind w:firstLine="720"/>
         <w:jc w:val="both"/>
       </w:pPr>
       <w:r>
@@ -5590,7 +5709,7 @@
           <w:rFonts w:ascii="Times New Roman" w:hAnsi="Times New Roman"/>
           <w:b w:val="0"/>
           <w:i w:val="0"/>
-          <w:color w:val="1E293B"/>
+          <w:color w:val="000000"/>
           <w:sz w:val="26"/>
         </w:rPr>
         <w:t>Đồ án Game Siêu Clicker Tam Hợp đã hoàn thành đúng tiến độ, đáp ứng đầy đủ các yêu cầu kỹ thuật và tính năng đặt ra. Hệ thống không chỉ mang lại trải nghiệm giải trí ấn tượng với đồ họa hoạt hình 3D mượt mà mà còn khẳng định tính khả thi của việc kết hợp các công nghệ Web hiện đại (React 19, Node.js, Socket.io, MySQL) trong các bài toán thực tế.</w:t>
@@ -5598,8 +5717,8 @@
     </w:p>
     <w:p>
       <w:pPr>
-        <w:spacing w:before="40" w:after="100" w:line="288" w:lineRule="auto"/>
-        <w:ind w:firstLine="432"/>
+        <w:spacing w:before="40" w:after="80" w:line="288" w:lineRule="auto"/>
+        <w:ind w:firstLine="720"/>
         <w:jc w:val="both"/>
       </w:pPr>
       <w:r>
@@ -5607,7 +5726,7 @@
           <w:rFonts w:ascii="Times New Roman" w:hAnsi="Times New Roman"/>
           <w:b w:val="0"/>
           <w:i w:val="0"/>
-          <w:color w:val="1E293B"/>
+          <w:color w:val="000000"/>
           <w:sz w:val="26"/>
         </w:rPr>
         <w:t>Trong tương lai, nhóm sẽ tiếp tục phát triển thêm các tính năng như: Bảng xếp hạng toàn cầu (Global Leaderboard), tích hợp ví vật phẩm NFT và mở rộng thêm nhiều đồ họa Theme phong phú hơn nữa.</w:t>

</xml_diff>